<commit_message>
Added programmer manuel and timeline
</commit_message>
<xml_diff>
--- a/Specification.docx
+++ b/Specification.docx
@@ -585,25 +585,7 @@
         <w:ind w:left="360"/>
       </w:pPr>
       <w:r>
-        <w:t>Manual cell segmentation in time-lapse microscopy is one of the most time-consuming tasks in quantitative biology. A single experiment can produce hundreds of frames, each containing hundreds of cells</w:t>
-      </w:r>
-      <w:r>
-        <w:t>, depending on the experiment and time</w:t>
-      </w:r>
-      <w:r>
-        <w:t>. Annotating every frame by hand can take days</w:t>
-      </w:r>
-      <w:r>
-        <w:t xml:space="preserve"> to complete</w:t>
-      </w:r>
-      <w:r>
-        <w:t>, and</w:t>
-      </w:r>
-      <w:r>
-        <w:t xml:space="preserve"> </w:t>
-      </w:r>
-      <w:r>
-        <w:t>results are often subjective and inconsistent between annotators.</w:t>
+        <w:t>Manual cell segmentation in time-lapse microscopy is one of the most time-consuming tasks in quantitative biology. A single experiment can produce hundreds of frames, each containing hundreds of cells, depending on the experiment and time. Annotating every frame by hand can take days to complete, and results are often subjective and inconsistent between annotators.</w:t>
       </w:r>
     </w:p>
     <w:p>
@@ -655,10 +637,7 @@
       </w:pPr>
       <w:r>
         <w:lastRenderedPageBreak/>
-        <w:t xml:space="preserve">The project utilizes TRAgen-generated synthetic sequences. These sequences provide known trajectories, growth patterns, and dicision events, </w:t>
-      </w:r>
-      <w:r>
-        <w:t>allowing objective measurement of segmentation accuracy</w:t>
+        <w:t>The project utilizes TRAgen-generated synthetic sequences. These sequences provide known trajectories, growth patterns, and dicision events, allowing objective measurement of segmentation accuracy</w:t>
       </w:r>
     </w:p>
     <w:p>
@@ -947,7 +926,117 @@
     </w:p>
     <w:p>
       <w:pPr>
-        <w:pStyle w:val="ListParagraph"/>
+        <w:ind w:left="360"/>
+      </w:pPr>
+      <w:r>
+        <w:t>This section</w:t>
+      </w:r>
+      <w:r>
+        <w:t xml:space="preserve"> explains the technical implementation and architecture method for the software</w:t>
+      </w:r>
+    </w:p>
+    <w:p>
+      <w:pPr>
+        <w:ind w:left="360"/>
+      </w:pPr>
+    </w:p>
+    <w:p>
+      <w:pPr>
+        <w:ind w:left="360"/>
+      </w:pPr>
+      <w:r>
+        <w:t>System Architecture:</w:t>
+      </w:r>
+    </w:p>
+    <w:p>
+      <w:pPr>
+        <w:pStyle w:val="ListParagraph"/>
+        <w:numPr>
+          <w:ilvl w:val="0"/>
+          <w:numId w:val="5"/>
+        </w:numPr>
+      </w:pPr>
+      <w:r>
+        <w:t>Data Module: Handles image ingestion and ground-truth comparison from TRAgen datasts.</w:t>
+      </w:r>
+    </w:p>
+    <w:p>
+      <w:pPr>
+        <w:pStyle w:val="ListParagraph"/>
+        <w:numPr>
+          <w:ilvl w:val="0"/>
+          <w:numId w:val="5"/>
+        </w:numPr>
+      </w:pPr>
+      <w:r>
+        <w:t>Segmentation Engine: Wraps a deep learning model to handle frame-by-fame mask updates.</w:t>
+      </w:r>
+    </w:p>
+    <w:p>
+      <w:pPr>
+        <w:pStyle w:val="ListParagraph"/>
+        <w:numPr>
+          <w:ilvl w:val="0"/>
+          <w:numId w:val="5"/>
+        </w:numPr>
+      </w:pPr>
+      <w:r>
+        <w:t>Tracking Logic: Implements the non-trivial logic required to maintain cell identities over time and detect topological changes like mitosis (cell division)</w:t>
+      </w:r>
+    </w:p>
+    <w:p/>
+    <w:p/>
+    <w:p>
+      <w:pPr>
+        <w:pStyle w:val="ListParagraph"/>
+        <w:ind w:left="1440"/>
+      </w:pPr>
+    </w:p>
+    <w:p>
+      <w:r>
+        <w:lastRenderedPageBreak/>
+        <w:t xml:space="preserve">      Technology Stack:</w:t>
+      </w:r>
+    </w:p>
+    <w:p>
+      <w:pPr>
+        <w:pStyle w:val="ListParagraph"/>
+        <w:numPr>
+          <w:ilvl w:val="0"/>
+          <w:numId w:val="5"/>
+        </w:numPr>
+      </w:pPr>
+      <w:r>
+        <w:t>Programming Language: Python</w:t>
+      </w:r>
+    </w:p>
+    <w:p>
+      <w:pPr>
+        <w:pStyle w:val="ListParagraph"/>
+        <w:numPr>
+          <w:ilvl w:val="0"/>
+          <w:numId w:val="5"/>
+        </w:numPr>
+      </w:pPr>
+      <w:r>
+        <w:t>Frameworks: PyTorch for model inference and NumPy for image manipulation</w:t>
+      </w:r>
+    </w:p>
+    <w:p>
+      <w:pPr>
+        <w:pStyle w:val="ListParagraph"/>
+        <w:numPr>
+          <w:ilvl w:val="0"/>
+          <w:numId w:val="5"/>
+        </w:numPr>
+      </w:pPr>
+      <w:r>
+        <w:t>Versioning: The project will utilize GitLab for version control and bug tracking</w:t>
+      </w:r>
+    </w:p>
+    <w:p>
+      <w:pPr>
+        <w:ind w:left="360"/>
         <w:rPr>
           <w:b/>
           <w:bCs/>
@@ -959,7 +1048,557 @@
     </w:p>
     <w:p>
       <w:pPr>
-        <w:ind w:left="360"/>
+        <w:pStyle w:val="ListParagraph"/>
+        <w:numPr>
+          <w:ilvl w:val="0"/>
+          <w:numId w:val="3"/>
+        </w:numPr>
+        <w:rPr>
+          <w:b/>
+          <w:bCs/>
+          <w:color w:val="4C94D8" w:themeColor="text2" w:themeTint="80"/>
+          <w:sz w:val="32"/>
+          <w:szCs w:val="32"/>
+        </w:rPr>
+      </w:pPr>
+      <w:r>
+        <w:rPr>
+          <w:b/>
+          <w:bCs/>
+          <w:color w:val="4C94D8" w:themeColor="text2" w:themeTint="80"/>
+          <w:sz w:val="32"/>
+          <w:szCs w:val="32"/>
+        </w:rPr>
+        <w:t>Timeline &amp; Milestones</w:t>
+      </w:r>
+    </w:p>
+    <w:p>
+      <w:pPr>
+        <w:pStyle w:val="ListParagraph"/>
+        <w:rPr>
+          <w:b/>
+          <w:bCs/>
+          <w:color w:val="4C94D8" w:themeColor="text2" w:themeTint="80"/>
+          <w:sz w:val="32"/>
+          <w:szCs w:val="32"/>
+        </w:rPr>
+      </w:pPr>
+    </w:p>
+    <w:tbl>
+      <w:tblPr>
+        <w:tblW w:w="9026" w:type="dxa"/>
+        <w:tblInd w:w="338" w:type="dxa"/>
+        <w:tblBorders>
+          <w:top w:val="single" w:sz="4" w:space="0" w:color="auto"/>
+          <w:left w:val="single" w:sz="4" w:space="0" w:color="auto"/>
+          <w:bottom w:val="single" w:sz="4" w:space="0" w:color="auto"/>
+          <w:right w:val="single" w:sz="4" w:space="0" w:color="auto"/>
+          <w:insideH w:val="single" w:sz="4" w:space="0" w:color="auto"/>
+          <w:insideV w:val="single" w:sz="4" w:space="0" w:color="auto"/>
+        </w:tblBorders>
+        <w:tblCellMar>
+          <w:left w:w="10" w:type="dxa"/>
+          <w:right w:w="10" w:type="dxa"/>
+        </w:tblCellMar>
+        <w:tblLook w:val="04A0" w:firstRow="1" w:lastRow="0" w:firstColumn="1" w:lastColumn="0" w:noHBand="0" w:noVBand="1"/>
+      </w:tblPr>
+      <w:tblGrid>
+        <w:gridCol w:w="1800"/>
+        <w:gridCol w:w="4000"/>
+        <w:gridCol w:w="3226"/>
+      </w:tblGrid>
+      <w:tr>
+        <w:tc>
+          <w:tcPr>
+            <w:tcW w:w="1800" w:type="dxa"/>
+            <w:tcBorders>
+              <w:top w:val="single" w:sz="1" w:space="0" w:color="CCCCCC"/>
+              <w:left w:val="single" w:sz="1" w:space="0" w:color="CCCCCC"/>
+              <w:bottom w:val="single" w:sz="1" w:space="0" w:color="CCCCCC"/>
+              <w:right w:val="single" w:sz="1" w:space="0" w:color="CCCCCC"/>
+            </w:tcBorders>
+            <w:shd w:val="clear" w:color="auto" w:fill="D5E8F0"/>
+            <w:tcMar>
+              <w:top w:w="80" w:type="dxa"/>
+              <w:left w:w="120" w:type="dxa"/>
+              <w:bottom w:w="80" w:type="dxa"/>
+              <w:right w:w="120" w:type="dxa"/>
+            </w:tcMar>
+          </w:tcPr>
+          <w:p>
+            <w:r>
+              <w:rPr>
+                <w:b/>
+                <w:bCs/>
+              </w:rPr>
+              <w:t>Date</w:t>
+            </w:r>
+          </w:p>
+        </w:tc>
+        <w:tc>
+          <w:tcPr>
+            <w:tcW w:w="4000" w:type="dxa"/>
+            <w:tcBorders>
+              <w:top w:val="single" w:sz="1" w:space="0" w:color="CCCCCC"/>
+              <w:left w:val="single" w:sz="1" w:space="0" w:color="CCCCCC"/>
+              <w:bottom w:val="single" w:sz="1" w:space="0" w:color="CCCCCC"/>
+              <w:right w:val="single" w:sz="1" w:space="0" w:color="CCCCCC"/>
+            </w:tcBorders>
+            <w:shd w:val="clear" w:color="auto" w:fill="D5E8F0"/>
+            <w:tcMar>
+              <w:top w:w="80" w:type="dxa"/>
+              <w:left w:w="120" w:type="dxa"/>
+              <w:bottom w:w="80" w:type="dxa"/>
+              <w:right w:w="120" w:type="dxa"/>
+            </w:tcMar>
+          </w:tcPr>
+          <w:p>
+            <w:r>
+              <w:rPr>
+                <w:b/>
+                <w:bCs/>
+              </w:rPr>
+              <w:t>Milestone</w:t>
+            </w:r>
+          </w:p>
+        </w:tc>
+        <w:tc>
+          <w:tcPr>
+            <w:tcW w:w="3226" w:type="dxa"/>
+            <w:tcBorders>
+              <w:top w:val="single" w:sz="1" w:space="0" w:color="CCCCCC"/>
+              <w:left w:val="single" w:sz="1" w:space="0" w:color="CCCCCC"/>
+              <w:bottom w:val="single" w:sz="1" w:space="0" w:color="CCCCCC"/>
+              <w:right w:val="single" w:sz="1" w:space="0" w:color="CCCCCC"/>
+            </w:tcBorders>
+            <w:shd w:val="clear" w:color="auto" w:fill="D5E8F0"/>
+            <w:tcMar>
+              <w:top w:w="80" w:type="dxa"/>
+              <w:left w:w="120" w:type="dxa"/>
+              <w:bottom w:w="80" w:type="dxa"/>
+              <w:right w:w="120" w:type="dxa"/>
+            </w:tcMar>
+          </w:tcPr>
+          <w:p>
+            <w:r>
+              <w:rPr>
+                <w:b/>
+                <w:bCs/>
+              </w:rPr>
+              <w:t>Presentation</w:t>
+            </w:r>
+          </w:p>
+        </w:tc>
+      </w:tr>
+      <w:tr>
+        <w:tc>
+          <w:tcPr>
+            <w:tcW w:w="1800" w:type="dxa"/>
+            <w:tcBorders>
+              <w:top w:val="single" w:sz="1" w:space="0" w:color="CCCCCC"/>
+              <w:left w:val="single" w:sz="1" w:space="0" w:color="CCCCCC"/>
+              <w:bottom w:val="single" w:sz="1" w:space="0" w:color="CCCCCC"/>
+              <w:right w:val="single" w:sz="1" w:space="0" w:color="CCCCCC"/>
+            </w:tcBorders>
+            <w:shd w:val="clear" w:color="auto" w:fill="FFFFFF"/>
+            <w:tcMar>
+              <w:top w:w="80" w:type="dxa"/>
+              <w:left w:w="120" w:type="dxa"/>
+              <w:bottom w:w="80" w:type="dxa"/>
+              <w:right w:w="120" w:type="dxa"/>
+            </w:tcMar>
+          </w:tcPr>
+          <w:p>
+            <w:r>
+              <w:t xml:space="preserve">March </w:t>
+            </w:r>
+            <w:r>
+              <w:t>2026</w:t>
+            </w:r>
+          </w:p>
+        </w:tc>
+        <w:tc>
+          <w:tcPr>
+            <w:tcW w:w="4000" w:type="dxa"/>
+            <w:tcBorders>
+              <w:top w:val="single" w:sz="1" w:space="0" w:color="CCCCCC"/>
+              <w:left w:val="single" w:sz="1" w:space="0" w:color="CCCCCC"/>
+              <w:bottom w:val="single" w:sz="1" w:space="0" w:color="CCCCCC"/>
+              <w:right w:val="single" w:sz="1" w:space="0" w:color="CCCCCC"/>
+            </w:tcBorders>
+            <w:shd w:val="clear" w:color="auto" w:fill="FFFFFF"/>
+            <w:tcMar>
+              <w:top w:w="80" w:type="dxa"/>
+              <w:left w:w="120" w:type="dxa"/>
+              <w:bottom w:w="80" w:type="dxa"/>
+              <w:right w:w="120" w:type="dxa"/>
+            </w:tcMar>
+          </w:tcPr>
+          <w:p>
+            <w:r>
+              <w:t>Project specification completed and uploaded to GitLab</w:t>
+            </w:r>
+          </w:p>
+        </w:tc>
+        <w:tc>
+          <w:tcPr>
+            <w:tcW w:w="3226" w:type="dxa"/>
+            <w:tcBorders>
+              <w:top w:val="single" w:sz="1" w:space="0" w:color="CCCCCC"/>
+              <w:left w:val="single" w:sz="1" w:space="0" w:color="CCCCCC"/>
+              <w:bottom w:val="single" w:sz="1" w:space="0" w:color="CCCCCC"/>
+              <w:right w:val="single" w:sz="1" w:space="0" w:color="CCCCCC"/>
+            </w:tcBorders>
+            <w:shd w:val="clear" w:color="auto" w:fill="FFFFFF"/>
+            <w:tcMar>
+              <w:top w:w="80" w:type="dxa"/>
+              <w:left w:w="120" w:type="dxa"/>
+              <w:bottom w:w="80" w:type="dxa"/>
+              <w:right w:w="120" w:type="dxa"/>
+            </w:tcMar>
+          </w:tcPr>
+          <w:p>
+            <w:r>
+              <w:t>GitLab commit</w:t>
+            </w:r>
+          </w:p>
+        </w:tc>
+      </w:tr>
+      <w:tr>
+        <w:tc>
+          <w:tcPr>
+            <w:tcW w:w="1800" w:type="dxa"/>
+            <w:tcBorders>
+              <w:top w:val="single" w:sz="1" w:space="0" w:color="CCCCCC"/>
+              <w:left w:val="single" w:sz="1" w:space="0" w:color="CCCCCC"/>
+              <w:bottom w:val="single" w:sz="1" w:space="0" w:color="CCCCCC"/>
+              <w:right w:val="single" w:sz="1" w:space="0" w:color="CCCCCC"/>
+            </w:tcBorders>
+            <w:shd w:val="clear" w:color="auto" w:fill="FFFFFF"/>
+            <w:tcMar>
+              <w:top w:w="80" w:type="dxa"/>
+              <w:left w:w="120" w:type="dxa"/>
+              <w:bottom w:w="80" w:type="dxa"/>
+              <w:right w:w="120" w:type="dxa"/>
+            </w:tcMar>
+          </w:tcPr>
+          <w:p>
+            <w:r>
+              <w:t>May 2026</w:t>
+            </w:r>
+          </w:p>
+        </w:tc>
+        <w:tc>
+          <w:tcPr>
+            <w:tcW w:w="4000" w:type="dxa"/>
+            <w:tcBorders>
+              <w:top w:val="single" w:sz="1" w:space="0" w:color="CCCCCC"/>
+              <w:left w:val="single" w:sz="1" w:space="0" w:color="CCCCCC"/>
+              <w:bottom w:val="single" w:sz="1" w:space="0" w:color="CCCCCC"/>
+              <w:right w:val="single" w:sz="1" w:space="0" w:color="CCCCCC"/>
+            </w:tcBorders>
+            <w:shd w:val="clear" w:color="auto" w:fill="FFFFFF"/>
+            <w:tcMar>
+              <w:top w:w="80" w:type="dxa"/>
+              <w:left w:w="120" w:type="dxa"/>
+              <w:bottom w:w="80" w:type="dxa"/>
+              <w:right w:w="120" w:type="dxa"/>
+            </w:tcMar>
+          </w:tcPr>
+          <w:p>
+            <w:r>
+              <w:t>TRAgen data generation pipeline working; dataset of 80+ frames generated on lab server</w:t>
+            </w:r>
+          </w:p>
+        </w:tc>
+        <w:tc>
+          <w:tcPr>
+            <w:tcW w:w="3226" w:type="dxa"/>
+            <w:tcBorders>
+              <w:top w:val="single" w:sz="1" w:space="0" w:color="CCCCCC"/>
+              <w:left w:val="single" w:sz="1" w:space="0" w:color="CCCCCC"/>
+              <w:bottom w:val="single" w:sz="1" w:space="0" w:color="CCCCCC"/>
+              <w:right w:val="single" w:sz="1" w:space="0" w:color="CCCCCC"/>
+            </w:tcBorders>
+            <w:shd w:val="clear" w:color="auto" w:fill="FFFFFF"/>
+            <w:tcMar>
+              <w:top w:w="80" w:type="dxa"/>
+              <w:left w:w="120" w:type="dxa"/>
+              <w:bottom w:w="80" w:type="dxa"/>
+              <w:right w:w="120" w:type="dxa"/>
+            </w:tcMar>
+          </w:tcPr>
+          <w:p>
+            <w:r>
+              <w:t>Demo on server</w:t>
+            </w:r>
+          </w:p>
+        </w:tc>
+      </w:tr>
+      <w:tr>
+        <w:tc>
+          <w:tcPr>
+            <w:tcW w:w="1800" w:type="dxa"/>
+            <w:tcBorders>
+              <w:top w:val="single" w:sz="1" w:space="0" w:color="CCCCCC"/>
+              <w:left w:val="single" w:sz="1" w:space="0" w:color="CCCCCC"/>
+              <w:bottom w:val="single" w:sz="1" w:space="0" w:color="CCCCCC"/>
+              <w:right w:val="single" w:sz="1" w:space="0" w:color="CCCCCC"/>
+            </w:tcBorders>
+            <w:shd w:val="clear" w:color="auto" w:fill="FFFFFF"/>
+            <w:tcMar>
+              <w:top w:w="80" w:type="dxa"/>
+              <w:left w:w="120" w:type="dxa"/>
+              <w:bottom w:w="80" w:type="dxa"/>
+              <w:right w:w="120" w:type="dxa"/>
+            </w:tcMar>
+          </w:tcPr>
+          <w:p>
+            <w:r>
+              <w:t>June 2026</w:t>
+            </w:r>
+          </w:p>
+        </w:tc>
+        <w:tc>
+          <w:tcPr>
+            <w:tcW w:w="4000" w:type="dxa"/>
+            <w:tcBorders>
+              <w:top w:val="single" w:sz="1" w:space="0" w:color="CCCCCC"/>
+              <w:left w:val="single" w:sz="1" w:space="0" w:color="CCCCCC"/>
+              <w:bottom w:val="single" w:sz="1" w:space="0" w:color="CCCCCC"/>
+              <w:right w:val="single" w:sz="1" w:space="0" w:color="CCCCCC"/>
+            </w:tcBorders>
+            <w:shd w:val="clear" w:color="auto" w:fill="FFFFFF"/>
+            <w:tcMar>
+              <w:top w:w="80" w:type="dxa"/>
+              <w:left w:w="120" w:type="dxa"/>
+              <w:bottom w:w="80" w:type="dxa"/>
+              <w:right w:w="120" w:type="dxa"/>
+            </w:tcMar>
+          </w:tcPr>
+          <w:p/>
+        </w:tc>
+        <w:tc>
+          <w:tcPr>
+            <w:tcW w:w="3226" w:type="dxa"/>
+            <w:tcBorders>
+              <w:top w:val="single" w:sz="1" w:space="0" w:color="CCCCCC"/>
+              <w:left w:val="single" w:sz="1" w:space="0" w:color="CCCCCC"/>
+              <w:bottom w:val="single" w:sz="1" w:space="0" w:color="CCCCCC"/>
+              <w:right w:val="single" w:sz="1" w:space="0" w:color="CCCCCC"/>
+            </w:tcBorders>
+            <w:shd w:val="clear" w:color="auto" w:fill="FFFFFF"/>
+            <w:tcMar>
+              <w:top w:w="80" w:type="dxa"/>
+              <w:left w:w="120" w:type="dxa"/>
+              <w:bottom w:w="80" w:type="dxa"/>
+              <w:right w:w="120" w:type="dxa"/>
+            </w:tcMar>
+          </w:tcPr>
+          <w:p/>
+        </w:tc>
+      </w:tr>
+      <w:tr>
+        <w:tc>
+          <w:tcPr>
+            <w:tcW w:w="1800" w:type="dxa"/>
+            <w:tcBorders>
+              <w:top w:val="single" w:sz="1" w:space="0" w:color="CCCCCC"/>
+              <w:left w:val="single" w:sz="1" w:space="0" w:color="CCCCCC"/>
+              <w:bottom w:val="single" w:sz="1" w:space="0" w:color="CCCCCC"/>
+              <w:right w:val="single" w:sz="1" w:space="0" w:color="CCCCCC"/>
+            </w:tcBorders>
+            <w:shd w:val="clear" w:color="auto" w:fill="FFFFFF"/>
+            <w:tcMar>
+              <w:top w:w="80" w:type="dxa"/>
+              <w:left w:w="120" w:type="dxa"/>
+              <w:bottom w:w="80" w:type="dxa"/>
+              <w:right w:w="120" w:type="dxa"/>
+            </w:tcMar>
+          </w:tcPr>
+          <w:p>
+            <w:r>
+              <w:t>July 2026</w:t>
+            </w:r>
+          </w:p>
+        </w:tc>
+        <w:tc>
+          <w:tcPr>
+            <w:tcW w:w="4000" w:type="dxa"/>
+            <w:tcBorders>
+              <w:top w:val="single" w:sz="1" w:space="0" w:color="CCCCCC"/>
+              <w:left w:val="single" w:sz="1" w:space="0" w:color="CCCCCC"/>
+              <w:bottom w:val="single" w:sz="1" w:space="0" w:color="CCCCCC"/>
+              <w:right w:val="single" w:sz="1" w:space="0" w:color="CCCCCC"/>
+            </w:tcBorders>
+            <w:shd w:val="clear" w:color="auto" w:fill="FFFFFF"/>
+            <w:tcMar>
+              <w:top w:w="80" w:type="dxa"/>
+              <w:left w:w="120" w:type="dxa"/>
+              <w:bottom w:w="80" w:type="dxa"/>
+              <w:right w:w="120" w:type="dxa"/>
+            </w:tcMar>
+          </w:tcPr>
+          <w:p/>
+        </w:tc>
+        <w:tc>
+          <w:tcPr>
+            <w:tcW w:w="3226" w:type="dxa"/>
+            <w:tcBorders>
+              <w:top w:val="single" w:sz="1" w:space="0" w:color="CCCCCC"/>
+              <w:left w:val="single" w:sz="1" w:space="0" w:color="CCCCCC"/>
+              <w:bottom w:val="single" w:sz="1" w:space="0" w:color="CCCCCC"/>
+              <w:right w:val="single" w:sz="1" w:space="0" w:color="CCCCCC"/>
+            </w:tcBorders>
+            <w:shd w:val="clear" w:color="auto" w:fill="FFFFFF"/>
+            <w:tcMar>
+              <w:top w:w="80" w:type="dxa"/>
+              <w:left w:w="120" w:type="dxa"/>
+              <w:bottom w:w="80" w:type="dxa"/>
+              <w:right w:w="120" w:type="dxa"/>
+            </w:tcMar>
+          </w:tcPr>
+          <w:p/>
+        </w:tc>
+      </w:tr>
+      <w:tr>
+        <w:tc>
+          <w:tcPr>
+            <w:tcW w:w="1800" w:type="dxa"/>
+            <w:tcBorders>
+              <w:top w:val="single" w:sz="1" w:space="0" w:color="CCCCCC"/>
+              <w:left w:val="single" w:sz="1" w:space="0" w:color="CCCCCC"/>
+              <w:bottom w:val="single" w:sz="1" w:space="0" w:color="CCCCCC"/>
+              <w:right w:val="single" w:sz="1" w:space="0" w:color="CCCCCC"/>
+            </w:tcBorders>
+            <w:shd w:val="clear" w:color="auto" w:fill="FFFFFF"/>
+            <w:tcMar>
+              <w:top w:w="80" w:type="dxa"/>
+              <w:left w:w="120" w:type="dxa"/>
+              <w:bottom w:w="80" w:type="dxa"/>
+              <w:right w:w="120" w:type="dxa"/>
+            </w:tcMar>
+          </w:tcPr>
+          <w:p>
+            <w:r>
+              <w:t>August 2026</w:t>
+            </w:r>
+          </w:p>
+        </w:tc>
+        <w:tc>
+          <w:tcPr>
+            <w:tcW w:w="4000" w:type="dxa"/>
+            <w:tcBorders>
+              <w:top w:val="single" w:sz="1" w:space="0" w:color="CCCCCC"/>
+              <w:left w:val="single" w:sz="1" w:space="0" w:color="CCCCCC"/>
+              <w:bottom w:val="single" w:sz="1" w:space="0" w:color="CCCCCC"/>
+              <w:right w:val="single" w:sz="1" w:space="0" w:color="CCCCCC"/>
+            </w:tcBorders>
+            <w:shd w:val="clear" w:color="auto" w:fill="FFFFFF"/>
+            <w:tcMar>
+              <w:top w:w="80" w:type="dxa"/>
+              <w:left w:w="120" w:type="dxa"/>
+              <w:bottom w:w="80" w:type="dxa"/>
+              <w:right w:w="120" w:type="dxa"/>
+            </w:tcMar>
+          </w:tcPr>
+          <w:p/>
+        </w:tc>
+        <w:tc>
+          <w:tcPr>
+            <w:tcW w:w="3226" w:type="dxa"/>
+            <w:tcBorders>
+              <w:top w:val="single" w:sz="1" w:space="0" w:color="CCCCCC"/>
+              <w:left w:val="single" w:sz="1" w:space="0" w:color="CCCCCC"/>
+              <w:bottom w:val="single" w:sz="1" w:space="0" w:color="CCCCCC"/>
+              <w:right w:val="single" w:sz="1" w:space="0" w:color="CCCCCC"/>
+            </w:tcBorders>
+            <w:shd w:val="clear" w:color="auto" w:fill="FFFFFF"/>
+            <w:tcMar>
+              <w:top w:w="80" w:type="dxa"/>
+              <w:left w:w="120" w:type="dxa"/>
+              <w:bottom w:w="80" w:type="dxa"/>
+              <w:right w:w="120" w:type="dxa"/>
+            </w:tcMar>
+          </w:tcPr>
+          <w:p/>
+        </w:tc>
+      </w:tr>
+      <w:tr>
+        <w:tc>
+          <w:tcPr>
+            <w:tcW w:w="1800" w:type="dxa"/>
+            <w:tcBorders>
+              <w:top w:val="single" w:sz="1" w:space="0" w:color="CCCCCC"/>
+              <w:left w:val="single" w:sz="1" w:space="0" w:color="CCCCCC"/>
+              <w:bottom w:val="single" w:sz="1" w:space="0" w:color="CCCCCC"/>
+              <w:right w:val="single" w:sz="1" w:space="0" w:color="CCCCCC"/>
+            </w:tcBorders>
+            <w:shd w:val="clear" w:color="auto" w:fill="FFFFFF"/>
+            <w:tcMar>
+              <w:top w:w="80" w:type="dxa"/>
+              <w:left w:w="120" w:type="dxa"/>
+              <w:bottom w:w="80" w:type="dxa"/>
+              <w:right w:w="120" w:type="dxa"/>
+            </w:tcMar>
+          </w:tcPr>
+          <w:p>
+            <w:r>
+              <w:t>September 2026</w:t>
+            </w:r>
+          </w:p>
+        </w:tc>
+        <w:tc>
+          <w:tcPr>
+            <w:tcW w:w="4000" w:type="dxa"/>
+            <w:tcBorders>
+              <w:top w:val="single" w:sz="1" w:space="0" w:color="CCCCCC"/>
+              <w:left w:val="single" w:sz="1" w:space="0" w:color="CCCCCC"/>
+              <w:bottom w:val="single" w:sz="1" w:space="0" w:color="CCCCCC"/>
+              <w:right w:val="single" w:sz="1" w:space="0" w:color="CCCCCC"/>
+            </w:tcBorders>
+            <w:shd w:val="clear" w:color="auto" w:fill="FFFFFF"/>
+            <w:tcMar>
+              <w:top w:w="80" w:type="dxa"/>
+              <w:left w:w="120" w:type="dxa"/>
+              <w:bottom w:w="80" w:type="dxa"/>
+              <w:right w:w="120" w:type="dxa"/>
+            </w:tcMar>
+          </w:tcPr>
+          <w:p>
+            <w:r>
+              <w:t>Visualization and final cleanup; documentation written</w:t>
+            </w:r>
+          </w:p>
+        </w:tc>
+        <w:tc>
+          <w:tcPr>
+            <w:tcW w:w="3226" w:type="dxa"/>
+            <w:tcBorders>
+              <w:top w:val="single" w:sz="1" w:space="0" w:color="CCCCCC"/>
+              <w:left w:val="single" w:sz="1" w:space="0" w:color="CCCCCC"/>
+              <w:bottom w:val="single" w:sz="1" w:space="0" w:color="CCCCCC"/>
+              <w:right w:val="single" w:sz="1" w:space="0" w:color="CCCCCC"/>
+            </w:tcBorders>
+            <w:shd w:val="clear" w:color="auto" w:fill="FFFFFF"/>
+            <w:tcMar>
+              <w:top w:w="80" w:type="dxa"/>
+              <w:left w:w="120" w:type="dxa"/>
+              <w:bottom w:w="80" w:type="dxa"/>
+              <w:right w:w="120" w:type="dxa"/>
+            </w:tcMar>
+          </w:tcPr>
+          <w:p>
+            <w:r>
+              <w:t>Final demo + GitLab</w:t>
+            </w:r>
+          </w:p>
+        </w:tc>
+      </w:tr>
+    </w:tbl>
+    <w:p>
+      <w:pPr>
+        <w:pStyle w:val="ListParagraph"/>
         <w:rPr>
           <w:b/>
           <w:bCs/>

</xml_diff>

<commit_message>
Added problem analysis, implemented pipeline, and GUI specification
</commit_message>
<xml_diff>
--- a/Specification.docx
+++ b/Specification.docx
@@ -368,7 +368,7 @@
         <w:t xml:space="preserve">specific </w:t>
       </w:r>
       <w:r>
-        <w:t>variablity</w:t>
+        <w:t>variability</w:t>
       </w:r>
       <w:r>
         <w:t xml:space="preserve">, while fully manual annotation is </w:t>
@@ -538,12 +538,9 @@
           <w:sz w:val="32"/>
           <w:szCs w:val="32"/>
         </w:rPr>
-        <w:t xml:space="preserve">Berief Description </w:t>
-      </w:r>
-    </w:p>
-    <w:p>
-      <w:pPr>
-        <w:pStyle w:val="ListParagraph"/>
+        <w:t>B</w:t>
+      </w:r>
+      <w:r>
         <w:rPr>
           <w:b/>
           <w:bCs/>
@@ -551,6 +548,29 @@
           <w:sz w:val="32"/>
           <w:szCs w:val="32"/>
         </w:rPr>
+        <w:t>r</w:t>
+      </w:r>
+      <w:r>
+        <w:rPr>
+          <w:b/>
+          <w:bCs/>
+          <w:color w:val="4C94D8" w:themeColor="text2" w:themeTint="80"/>
+          <w:sz w:val="32"/>
+          <w:szCs w:val="32"/>
+        </w:rPr>
+        <w:t xml:space="preserve">ief Description </w:t>
+      </w:r>
+    </w:p>
+    <w:p>
+      <w:pPr>
+        <w:pStyle w:val="ListParagraph"/>
+        <w:rPr>
+          <w:b/>
+          <w:bCs/>
+          <w:color w:val="4C94D8" w:themeColor="text2" w:themeTint="80"/>
+          <w:sz w:val="32"/>
+          <w:szCs w:val="32"/>
+        </w:rPr>
       </w:pPr>
     </w:p>
     <w:p>
@@ -637,7 +657,13 @@
       </w:pPr>
       <w:r>
         <w:lastRenderedPageBreak/>
-        <w:t>The project utilizes TRAgen-generated synthetic sequences. These sequences provide known trajectories, growth patterns, and dicision events, allowing objective measurement of segmentation accuracy</w:t>
+        <w:t>The project utilizes TRAgen-generated synthetic sequences. These sequences provide known trajectories, growth patterns, and d</w:t>
+      </w:r>
+      <w:r>
+        <w:t>ivis</w:t>
+      </w:r>
+      <w:r>
+        <w:t>ion events, allowing objective measurement of segmentation accuracy</w:t>
       </w:r>
     </w:p>
     <w:p>
@@ -679,8 +705,220 @@
     </w:p>
     <w:p>
       <w:pPr>
-        <w:pStyle w:val="ListParagraph"/>
-        <w:ind w:left="1080"/>
+        <w:ind w:left="360"/>
+      </w:pPr>
+      <w:r>
+        <w:t xml:space="preserve">Time-lapse </w:t>
+      </w:r>
+      <w:r>
+        <w:t xml:space="preserve">microscopy </w:t>
+      </w:r>
+      <w:r>
+        <w:t xml:space="preserve">segmentation </w:t>
+      </w:r>
+      <w:r>
+        <w:t>aion introduces several challenges compared to single-image segmentation. Cells continuously move, change shape, grow, overlap, and divide during the sequence. Performing independent segmentation on every frame often causes unstable masks and identity inconsistence between frames.</w:t>
+      </w:r>
+    </w:p>
+    <w:p>
+      <w:pPr>
+        <w:ind w:left="360"/>
+      </w:pPr>
+    </w:p>
+    <w:p>
+      <w:pPr>
+        <w:ind w:left="360"/>
+      </w:pPr>
+      <w:r>
+        <w:t xml:space="preserve">The proposed solution uses semi-automatic propagation workflow. Instead of segmenting </w:t>
+      </w:r>
+      <w:r>
+        <w:t xml:space="preserve">each frame independently, the system uses information from the previous frame to guide segmentation in the next frame. </w:t>
+      </w:r>
+    </w:p>
+    <w:p>
+      <w:pPr>
+        <w:ind w:left="360"/>
+      </w:pPr>
+    </w:p>
+    <w:p>
+      <w:pPr>
+        <w:ind w:left="360"/>
+      </w:pPr>
+      <w:r>
+        <w:t>The software pipeline is based on the following logic:</w:t>
+      </w:r>
+    </w:p>
+    <w:p>
+      <w:pPr>
+        <w:pStyle w:val="ListParagraph"/>
+        <w:numPr>
+          <w:ilvl w:val="0"/>
+          <w:numId w:val="5"/>
+        </w:numPr>
+      </w:pPr>
+      <w:r>
+        <w:t xml:space="preserve">The user manually annotates </w:t>
+      </w:r>
+      <w:r>
+        <w:t xml:space="preserve">only </w:t>
+      </w:r>
+      <w:r>
+        <w:t>the first frame.</w:t>
+      </w:r>
+    </w:p>
+    <w:p>
+      <w:pPr>
+        <w:pStyle w:val="ListParagraph"/>
+        <w:numPr>
+          <w:ilvl w:val="0"/>
+          <w:numId w:val="5"/>
+        </w:numPr>
+      </w:pPr>
+      <w:r>
+        <w:t>This annotation initializes the segmentation process.</w:t>
+      </w:r>
+    </w:p>
+    <w:p>
+      <w:pPr>
+        <w:pStyle w:val="ListParagraph"/>
+        <w:numPr>
+          <w:ilvl w:val="0"/>
+          <w:numId w:val="5"/>
+        </w:numPr>
+      </w:pPr>
+      <w:r>
+        <w:t>The segmentation engine propagates masks through the sequence frame-by-frame.</w:t>
+      </w:r>
+    </w:p>
+    <w:p>
+      <w:pPr>
+        <w:pStyle w:val="ListParagraph"/>
+        <w:numPr>
+          <w:ilvl w:val="0"/>
+          <w:numId w:val="5"/>
+        </w:numPr>
+      </w:pPr>
+      <w:r>
+        <w:t>Previously generated masks act as spatial priors for subsequent predictions.</w:t>
+      </w:r>
+    </w:p>
+    <w:p>
+      <w:pPr>
+        <w:ind w:left="360"/>
+      </w:pPr>
+    </w:p>
+    <w:p>
+      <w:pPr>
+        <w:ind w:left="360"/>
+      </w:pPr>
+      <w:r>
+        <w:t>This design reduces manual annotation effort while maintaining temporal consistency.</w:t>
+      </w:r>
+    </w:p>
+    <w:p>
+      <w:pPr>
+        <w:ind w:left="360"/>
+      </w:pPr>
+    </w:p>
+    <w:p>
+      <w:pPr>
+        <w:ind w:left="360"/>
+      </w:pPr>
+      <w:r>
+        <w:t>The software also includes tracking logic to preserve cell identities across frames. Connected Component Analysis and overlap-based matching are used to associate segmented regions between conse</w:t>
+      </w:r>
+      <w:r>
+        <w:t>c</w:t>
+      </w:r>
+      <w:r>
+        <w:t>utive frames.</w:t>
+      </w:r>
+    </w:p>
+    <w:p>
+      <w:pPr>
+        <w:ind w:left="360"/>
+      </w:pPr>
+    </w:p>
+    <w:p>
+      <w:pPr>
+        <w:ind w:left="360"/>
+      </w:pPr>
+      <w:r>
+        <w:t>Special handling is required for mitosis events. If one segmented region frame t corresponds to multiple disconnected regions in frame t+1, the system interprets this as a possible cell division event and updates the lineage structure accordingly.</w:t>
+      </w:r>
+    </w:p>
+    <w:p>
+      <w:pPr>
+        <w:ind w:left="360"/>
+      </w:pPr>
+    </w:p>
+    <w:p>
+      <w:pPr>
+        <w:ind w:left="360"/>
+      </w:pPr>
+      <w:r>
+        <w:t>Synthetic sequences generated by TRAgen provide ground-truth masks and trajectories, enabling objective evaluation of:</w:t>
+      </w:r>
+    </w:p>
+    <w:p>
+      <w:pPr>
+        <w:ind w:left="360"/>
+      </w:pPr>
+    </w:p>
+    <w:p>
+      <w:pPr>
+        <w:pStyle w:val="ListParagraph"/>
+        <w:numPr>
+          <w:ilvl w:val="0"/>
+          <w:numId w:val="5"/>
+        </w:numPr>
+      </w:pPr>
+      <w:r>
+        <w:t xml:space="preserve">Segmentation accuracy </w:t>
+      </w:r>
+    </w:p>
+    <w:p>
+      <w:pPr>
+        <w:pStyle w:val="ListParagraph"/>
+        <w:numPr>
+          <w:ilvl w:val="0"/>
+          <w:numId w:val="5"/>
+        </w:numPr>
+      </w:pPr>
+      <w:r>
+        <w:t xml:space="preserve">Temporal consistency </w:t>
+      </w:r>
+    </w:p>
+    <w:p>
+      <w:pPr>
+        <w:pStyle w:val="ListParagraph"/>
+        <w:numPr>
+          <w:ilvl w:val="0"/>
+          <w:numId w:val="5"/>
+        </w:numPr>
+      </w:pPr>
+      <w:r>
+        <w:t xml:space="preserve">Cell tracking performance </w:t>
+      </w:r>
+    </w:p>
+    <w:p>
+      <w:pPr>
+        <w:pStyle w:val="ListParagraph"/>
+        <w:numPr>
+          <w:ilvl w:val="0"/>
+          <w:numId w:val="5"/>
+        </w:numPr>
+      </w:pPr>
+      <w:r>
+        <w:t xml:space="preserve">Mitosis detection quality </w:t>
+      </w:r>
+    </w:p>
+    <w:p/>
+    <w:p/>
+    <w:p/>
+    <w:p>
+      <w:pPr>
         <w:rPr>
           <w:b/>
           <w:bCs/>
@@ -713,182 +951,10 @@
           <w:sz w:val="32"/>
           <w:szCs w:val="32"/>
         </w:rPr>
-        <w:t xml:space="preserve">User Specification </w:t>
-      </w:r>
-    </w:p>
-    <w:p>
-      <w:pPr>
-        <w:ind w:left="360"/>
-      </w:pPr>
-      <w:r>
-        <w:t xml:space="preserve">The application is desgined as a tool for researchers to process microscopy sequences with minimal manual intervention </w:t>
-      </w:r>
-    </w:p>
-    <w:p>
-      <w:pPr>
-        <w:ind w:left="360"/>
-      </w:pPr>
-    </w:p>
-    <w:p>
-      <w:pPr>
-        <w:ind w:firstLine="360"/>
-        <w:rPr>
-          <w:b/>
-          <w:bCs/>
-        </w:rPr>
-      </w:pPr>
-      <w:r>
-        <w:rPr>
-          <w:b/>
-          <w:bCs/>
-        </w:rPr>
-        <w:t>Functional Requirements:</w:t>
-      </w:r>
-    </w:p>
-    <w:p>
-      <w:pPr>
-        <w:pStyle w:val="ListParagraph"/>
-        <w:numPr>
-          <w:ilvl w:val="0"/>
-          <w:numId w:val="5"/>
-        </w:numPr>
-      </w:pPr>
-      <w:r>
-        <w:rPr>
-          <w:b/>
-          <w:bCs/>
-        </w:rPr>
-        <w:t>Sequence Loading:</w:t>
-      </w:r>
-      <w:r>
-        <w:rPr>
-          <w:b/>
-          <w:bCs/>
-        </w:rPr>
-        <w:t xml:space="preserve"> </w:t>
-      </w:r>
-      <w:r>
-        <w:t xml:space="preserve">The user can import </w:t>
-      </w:r>
-      <w:r>
-        <w:t>time-lapse image sequences generated by TRAgen (TIFF stacks or PNG sequences)</w:t>
-      </w:r>
-    </w:p>
-    <w:p>
-      <w:pPr>
-        <w:pStyle w:val="ListParagraph"/>
-        <w:numPr>
-          <w:ilvl w:val="0"/>
-          <w:numId w:val="5"/>
-        </w:numPr>
-      </w:pPr>
-      <w:r>
-        <w:rPr>
-          <w:b/>
-          <w:bCs/>
-        </w:rPr>
-        <w:t>Interactive Initialization:</w:t>
-      </w:r>
-      <w:r>
-        <w:t xml:space="preserve"> </w:t>
-      </w:r>
-      <w:r>
-        <w:tab/>
-        <w:t>An interface allows the user to manually annotate the cell masks in the first frame using a brish or similar tool.</w:t>
-      </w:r>
-    </w:p>
-    <w:p>
-      <w:pPr>
-        <w:pStyle w:val="ListParagraph"/>
-        <w:numPr>
-          <w:ilvl w:val="0"/>
-          <w:numId w:val="5"/>
-        </w:numPr>
-      </w:pPr>
-      <w:r>
-        <w:rPr>
-          <w:b/>
-          <w:bCs/>
-        </w:rPr>
-        <w:t>Automated Propagation:</w:t>
-      </w:r>
-      <w:r>
-        <w:t xml:space="preserve"> A single start command triggers the deep learning engine to segment all subsequent frames based on the initial input.</w:t>
-      </w:r>
-    </w:p>
-    <w:p>
-      <w:pPr>
-        <w:pStyle w:val="ListParagraph"/>
-        <w:numPr>
-          <w:ilvl w:val="0"/>
-          <w:numId w:val="5"/>
-        </w:numPr>
-      </w:pPr>
-      <w:r>
-        <w:rPr>
-          <w:b/>
-          <w:bCs/>
-        </w:rPr>
-        <w:t>Review and Export:</w:t>
-      </w:r>
-      <w:r>
-        <w:t xml:space="preserve"> The user can play back the resulting segmentation and export the data as a labeled video overlay or a directory of binary masks.</w:t>
-      </w:r>
-    </w:p>
-    <w:p>
-      <w:pPr>
-        <w:pStyle w:val="ListParagraph"/>
-        <w:ind w:left="1440"/>
-      </w:pPr>
-    </w:p>
-    <w:p>
-      <w:pPr>
-        <w:rPr>
-          <w:b/>
-          <w:bCs/>
-        </w:rPr>
-      </w:pPr>
-      <w:r>
-        <w:rPr>
-          <w:b/>
-          <w:bCs/>
-        </w:rPr>
-        <w:t xml:space="preserve">      User Interface (UI)</w:t>
-      </w:r>
-      <w:r>
-        <w:rPr>
-          <w:b/>
-          <w:bCs/>
-        </w:rPr>
-        <w:t>:</w:t>
-      </w:r>
-    </w:p>
-    <w:p>
-      <w:pPr>
-        <w:pStyle w:val="ListParagraph"/>
-        <w:numPr>
-          <w:ilvl w:val="0"/>
-          <w:numId w:val="5"/>
-        </w:numPr>
-      </w:pPr>
-      <w:r>
-        <w:t>The application will feature a graphical user interface (GUI) developed in Python (Tkinter) to ensure non-programmers can use effectively.</w:t>
-      </w:r>
-    </w:p>
-    <w:p>
-      <w:pPr>
-        <w:pStyle w:val="ListParagraph"/>
-        <w:numPr>
-          <w:ilvl w:val="0"/>
-          <w:numId w:val="5"/>
-        </w:numPr>
-      </w:pPr>
-      <w:r>
-        <w:t xml:space="preserve">A preview window will display the original imagery alongside the generated masks for real-time verification </w:t>
-      </w:r>
-    </w:p>
-    <w:p>
-      <w:pPr>
+        <w:lastRenderedPageBreak/>
+        <w:t>User Specification</w:t>
+      </w:r>
+      <w:r>
         <w:rPr>
           <w:b/>
           <w:bCs/>
@@ -896,15 +962,9 @@
           <w:sz w:val="32"/>
           <w:szCs w:val="32"/>
         </w:rPr>
-      </w:pPr>
-    </w:p>
-    <w:p>
-      <w:pPr>
-        <w:pStyle w:val="ListParagraph"/>
-        <w:numPr>
-          <w:ilvl w:val="0"/>
-          <w:numId w:val="3"/>
-        </w:numPr>
+        <w:t xml:space="preserve"> (GUI &amp; Interaction) </w:t>
+      </w:r>
+      <w:r>
         <w:rPr>
           <w:b/>
           <w:bCs/>
@@ -912,8 +972,300 @@
           <w:sz w:val="32"/>
           <w:szCs w:val="32"/>
         </w:rPr>
-      </w:pPr>
-      <w:r>
+        <w:t xml:space="preserve"> </w:t>
+      </w:r>
+    </w:p>
+    <w:p>
+      <w:pPr>
+        <w:ind w:left="360"/>
+      </w:pPr>
+      <w:r>
+        <w:t>The application is desi</w:t>
+      </w:r>
+      <w:r>
+        <w:t>g</w:t>
+      </w:r>
+      <w:r>
+        <w:t xml:space="preserve">ned as a tool for researchers to process microscopy sequences with minimal manual intervention </w:t>
+      </w:r>
+    </w:p>
+    <w:p>
+      <w:pPr>
+        <w:ind w:left="360"/>
+      </w:pPr>
+    </w:p>
+    <w:p>
+      <w:pPr>
+        <w:ind w:firstLine="360"/>
+        <w:rPr>
+          <w:b/>
+          <w:bCs/>
+        </w:rPr>
+      </w:pPr>
+      <w:r>
+        <w:rPr>
+          <w:b/>
+          <w:bCs/>
+        </w:rPr>
+        <w:t>Functional Requirements:</w:t>
+      </w:r>
+    </w:p>
+    <w:p>
+      <w:pPr>
+        <w:pStyle w:val="ListParagraph"/>
+        <w:numPr>
+          <w:ilvl w:val="0"/>
+          <w:numId w:val="5"/>
+        </w:numPr>
+      </w:pPr>
+      <w:r>
+        <w:rPr>
+          <w:b/>
+          <w:bCs/>
+        </w:rPr>
+        <w:t>Sequence Loading:</w:t>
+      </w:r>
+      <w:r>
+        <w:rPr>
+          <w:b/>
+          <w:bCs/>
+        </w:rPr>
+        <w:t xml:space="preserve"> </w:t>
+      </w:r>
+      <w:r>
+        <w:t xml:space="preserve">The user can import </w:t>
+      </w:r>
+      <w:r>
+        <w:t>time-lapse image sequences generated by TRAgen (TIFF stacks or PNG sequences)</w:t>
+      </w:r>
+    </w:p>
+    <w:p>
+      <w:pPr>
+        <w:pStyle w:val="ListParagraph"/>
+        <w:numPr>
+          <w:ilvl w:val="0"/>
+          <w:numId w:val="5"/>
+        </w:numPr>
+      </w:pPr>
+      <w:r>
+        <w:rPr>
+          <w:b/>
+          <w:bCs/>
+        </w:rPr>
+        <w:t>Interactive Initialization:</w:t>
+      </w:r>
+      <w:r>
+        <w:t xml:space="preserve"> </w:t>
+      </w:r>
+      <w:r>
+        <w:tab/>
+        <w:t>An interface allows the user to manually annotate the cell masks in the first frame using a brish or similar tool.</w:t>
+      </w:r>
+    </w:p>
+    <w:p>
+      <w:pPr>
+        <w:pStyle w:val="ListParagraph"/>
+        <w:numPr>
+          <w:ilvl w:val="0"/>
+          <w:numId w:val="5"/>
+        </w:numPr>
+      </w:pPr>
+      <w:r>
+        <w:rPr>
+          <w:b/>
+          <w:bCs/>
+        </w:rPr>
+        <w:t>Automated Propagation:</w:t>
+      </w:r>
+      <w:r>
+        <w:t xml:space="preserve"> A single start command triggers the deep learning engine to segment all subsequent frames based on the initial input.</w:t>
+      </w:r>
+    </w:p>
+    <w:p>
+      <w:pPr>
+        <w:pStyle w:val="ListParagraph"/>
+        <w:numPr>
+          <w:ilvl w:val="0"/>
+          <w:numId w:val="5"/>
+        </w:numPr>
+      </w:pPr>
+      <w:r>
+        <w:rPr>
+          <w:b/>
+          <w:bCs/>
+        </w:rPr>
+        <w:t>Review and Export:</w:t>
+      </w:r>
+      <w:r>
+        <w:t xml:space="preserve"> The user can play back the resulting segmentation and export the data as a labeled video overlay or a directory of binary masks.</w:t>
+      </w:r>
+    </w:p>
+    <w:p>
+      <w:pPr>
+        <w:pStyle w:val="ListParagraph"/>
+        <w:ind w:left="1440"/>
+      </w:pPr>
+    </w:p>
+    <w:p>
+      <w:pPr>
+        <w:rPr>
+          <w:b/>
+          <w:bCs/>
+        </w:rPr>
+      </w:pPr>
+      <w:r>
+        <w:rPr>
+          <w:b/>
+          <w:bCs/>
+        </w:rPr>
+        <w:t xml:space="preserve">     </w:t>
+      </w:r>
+      <w:r>
+        <w:rPr>
+          <w:b/>
+          <w:bCs/>
+        </w:rPr>
+        <w:t xml:space="preserve">Graphical User </w:t>
+      </w:r>
+      <w:r>
+        <w:rPr>
+          <w:b/>
+          <w:bCs/>
+        </w:rPr>
+        <w:t>Interface (</w:t>
+      </w:r>
+      <w:r>
+        <w:rPr>
+          <w:b/>
+          <w:bCs/>
+        </w:rPr>
+        <w:t>G</w:t>
+      </w:r>
+      <w:r>
+        <w:rPr>
+          <w:b/>
+          <w:bCs/>
+        </w:rPr>
+        <w:t>UI)</w:t>
+      </w:r>
+      <w:r>
+        <w:rPr>
+          <w:b/>
+          <w:bCs/>
+        </w:rPr>
+        <w:t xml:space="preserve"> Detail:</w:t>
+      </w:r>
+    </w:p>
+    <w:p>
+      <w:pPr>
+        <w:pStyle w:val="ListParagraph"/>
+        <w:numPr>
+          <w:ilvl w:val="0"/>
+          <w:numId w:val="9"/>
+        </w:numPr>
+      </w:pPr>
+      <w:r>
+        <w:t>The application will feature a graphical user interface developed in Python   (Tkinter) to ensure non-programmers can use it effectively</w:t>
+      </w:r>
+      <w:r>
+        <w:t xml:space="preserve">. To make workflow working, the interface will be </w:t>
+      </w:r>
+      <w:r>
+        <w:t>organize</w:t>
+      </w:r>
+      <w:r>
+        <w:t>d into three fields:</w:t>
+      </w:r>
+    </w:p>
+    <w:p>
+      <w:pPr>
+        <w:pStyle w:val="ListParagraph"/>
+        <w:numPr>
+          <w:ilvl w:val="0"/>
+          <w:numId w:val="5"/>
+        </w:numPr>
+      </w:pPr>
+      <w:r>
+        <w:rPr>
+          <w:b/>
+          <w:bCs/>
+        </w:rPr>
+        <w:t>Toolbar/Sidebar:</w:t>
+      </w:r>
+      <w:r>
+        <w:t xml:space="preserve"> Contains buttons for data ingestion, tool s</w:t>
+      </w:r>
+      <w:r>
+        <w:t>e</w:t>
+      </w:r>
+      <w:r>
+        <w:t xml:space="preserve">lection, and the Start Propagation trigger </w:t>
+      </w:r>
+    </w:p>
+    <w:p>
+      <w:pPr>
+        <w:pStyle w:val="ListParagraph"/>
+        <w:numPr>
+          <w:ilvl w:val="0"/>
+          <w:numId w:val="5"/>
+        </w:numPr>
+      </w:pPr>
+      <w:r>
+        <w:rPr>
+          <w:b/>
+          <w:bCs/>
+        </w:rPr>
+        <w:t>Interactive Canvas:</w:t>
+      </w:r>
+      <w:r>
+        <w:t xml:space="preserve"> A central workspace where the user outlines cells on the first frame and </w:t>
+      </w:r>
+      <w:r>
+        <w:t>reviews</w:t>
+      </w:r>
+      <w:r>
+        <w:t xml:space="preserve"> real-time verification overlays </w:t>
+      </w:r>
+    </w:p>
+    <w:p>
+      <w:pPr>
+        <w:pStyle w:val="ListParagraph"/>
+        <w:numPr>
+          <w:ilvl w:val="0"/>
+          <w:numId w:val="5"/>
+        </w:numPr>
+      </w:pPr>
+      <w:r>
+        <w:rPr>
+          <w:b/>
+          <w:bCs/>
+        </w:rPr>
+        <w:t>Playback Contr</w:t>
+      </w:r>
+      <w:r>
+        <w:rPr>
+          <w:b/>
+          <w:bCs/>
+        </w:rPr>
+        <w:t>ols:</w:t>
+      </w:r>
+      <w:r>
+        <w:t xml:space="preserve"> A bottom bar with a timeline slider and Play/Pause buttons for reviewing the propagated masks across the full sequence.</w:t>
+      </w:r>
+    </w:p>
+    <w:p>
+      <w:pPr>
+        <w:pStyle w:val="ListParagraph"/>
+        <w:ind w:left="1440"/>
+      </w:pPr>
+    </w:p>
+    <w:p>
+      <w:pPr>
+        <w:pStyle w:val="ListParagraph"/>
+        <w:numPr>
+          <w:ilvl w:val="0"/>
+          <w:numId w:val="3"/>
+        </w:numPr>
         <w:rPr>
           <w:b/>
           <w:bCs/>
@@ -921,122 +1273,8 @@
           <w:sz w:val="32"/>
           <w:szCs w:val="32"/>
         </w:rPr>
-        <w:t>Programmer Specification</w:t>
-      </w:r>
-    </w:p>
-    <w:p>
-      <w:pPr>
-        <w:ind w:left="360"/>
-      </w:pPr>
-      <w:r>
-        <w:t>This section</w:t>
-      </w:r>
-      <w:r>
-        <w:t xml:space="preserve"> explains the technical implementation and architecture method for the software</w:t>
-      </w:r>
-    </w:p>
-    <w:p>
-      <w:pPr>
-        <w:ind w:left="360"/>
-      </w:pPr>
-    </w:p>
-    <w:p>
-      <w:pPr>
-        <w:ind w:left="360"/>
-      </w:pPr>
-      <w:r>
-        <w:t>System Architecture:</w:t>
-      </w:r>
-    </w:p>
-    <w:p>
-      <w:pPr>
-        <w:pStyle w:val="ListParagraph"/>
-        <w:numPr>
-          <w:ilvl w:val="0"/>
-          <w:numId w:val="5"/>
-        </w:numPr>
-      </w:pPr>
-      <w:r>
-        <w:t>Data Module: Handles image ingestion and ground-truth comparison from TRAgen datasts.</w:t>
-      </w:r>
-    </w:p>
-    <w:p>
-      <w:pPr>
-        <w:pStyle w:val="ListParagraph"/>
-        <w:numPr>
-          <w:ilvl w:val="0"/>
-          <w:numId w:val="5"/>
-        </w:numPr>
-      </w:pPr>
-      <w:r>
-        <w:t>Segmentation Engine: Wraps a deep learning model to handle frame-by-fame mask updates.</w:t>
-      </w:r>
-    </w:p>
-    <w:p>
-      <w:pPr>
-        <w:pStyle w:val="ListParagraph"/>
-        <w:numPr>
-          <w:ilvl w:val="0"/>
-          <w:numId w:val="5"/>
-        </w:numPr>
-      </w:pPr>
-      <w:r>
-        <w:t>Tracking Logic: Implements the non-trivial logic required to maintain cell identities over time and detect topological changes like mitosis (cell division)</w:t>
-      </w:r>
-    </w:p>
-    <w:p/>
-    <w:p/>
-    <w:p>
-      <w:pPr>
-        <w:pStyle w:val="ListParagraph"/>
-        <w:ind w:left="1440"/>
-      </w:pPr>
-    </w:p>
-    <w:p>
-      <w:r>
-        <w:lastRenderedPageBreak/>
-        <w:t xml:space="preserve">      Technology Stack:</w:t>
-      </w:r>
-    </w:p>
-    <w:p>
-      <w:pPr>
-        <w:pStyle w:val="ListParagraph"/>
-        <w:numPr>
-          <w:ilvl w:val="0"/>
-          <w:numId w:val="5"/>
-        </w:numPr>
-      </w:pPr>
-      <w:r>
-        <w:t>Programming Language: Python</w:t>
-      </w:r>
-    </w:p>
-    <w:p>
-      <w:pPr>
-        <w:pStyle w:val="ListParagraph"/>
-        <w:numPr>
-          <w:ilvl w:val="0"/>
-          <w:numId w:val="5"/>
-        </w:numPr>
-      </w:pPr>
-      <w:r>
-        <w:t>Frameworks: PyTorch for model inference and NumPy for image manipulation</w:t>
-      </w:r>
-    </w:p>
-    <w:p>
-      <w:pPr>
-        <w:pStyle w:val="ListParagraph"/>
-        <w:numPr>
-          <w:ilvl w:val="0"/>
-          <w:numId w:val="5"/>
-        </w:numPr>
-      </w:pPr>
-      <w:r>
-        <w:t>Versioning: The project will utilize GitLab for version control and bug tracking</w:t>
-      </w:r>
-    </w:p>
-    <w:p>
-      <w:pPr>
-        <w:ind w:left="360"/>
+      </w:pPr>
+      <w:r>
         <w:rPr>
           <w:b/>
           <w:bCs/>
@@ -1044,13 +1282,140 @@
           <w:sz w:val="32"/>
           <w:szCs w:val="32"/>
         </w:rPr>
-      </w:pPr>
-    </w:p>
-    <w:p>
-      <w:pPr>
-        <w:pStyle w:val="ListParagraph"/>
-        <w:numPr>
-          <w:ilvl w:val="0"/>
+        <w:t>Programmer Specification</w:t>
+      </w:r>
+    </w:p>
+    <w:p>
+      <w:pPr>
+        <w:ind w:left="360"/>
+      </w:pPr>
+      <w:r>
+        <w:t>This section</w:t>
+      </w:r>
+      <w:r>
+        <w:t xml:space="preserve"> explains the technical implementation and architecture method for the software</w:t>
+      </w:r>
+    </w:p>
+    <w:p>
+      <w:pPr>
+        <w:ind w:left="360"/>
+      </w:pPr>
+    </w:p>
+    <w:p>
+      <w:pPr>
+        <w:ind w:left="360"/>
+      </w:pPr>
+      <w:r>
+        <w:t>System Architecture:</w:t>
+      </w:r>
+    </w:p>
+    <w:p>
+      <w:pPr>
+        <w:pStyle w:val="ListParagraph"/>
+        <w:numPr>
+          <w:ilvl w:val="0"/>
+          <w:numId w:val="5"/>
+        </w:numPr>
+      </w:pPr>
+      <w:r>
+        <w:t xml:space="preserve">Data Module: Handles image ingestion and ground-truth comparison from TRAgen </w:t>
+      </w:r>
+      <w:r>
+        <w:t>datasets</w:t>
+      </w:r>
+      <w:r>
+        <w:t>.</w:t>
+      </w:r>
+    </w:p>
+    <w:p>
+      <w:pPr>
+        <w:pStyle w:val="ListParagraph"/>
+        <w:numPr>
+          <w:ilvl w:val="0"/>
+          <w:numId w:val="5"/>
+        </w:numPr>
+      </w:pPr>
+      <w:r>
+        <w:t>Segmentation Engine: Wraps a deep learning model to handle frame-by-</w:t>
+      </w:r>
+      <w:r>
+        <w:t>frame</w:t>
+      </w:r>
+      <w:r>
+        <w:t xml:space="preserve"> mask updates.</w:t>
+      </w:r>
+    </w:p>
+    <w:p>
+      <w:pPr>
+        <w:pStyle w:val="ListParagraph"/>
+        <w:numPr>
+          <w:ilvl w:val="0"/>
+          <w:numId w:val="5"/>
+        </w:numPr>
+      </w:pPr>
+      <w:r>
+        <w:t>Tracking Logic: Implements the non-trivial logic required to maintain cell identities over time and detect topological changes like mitosis (cell division)</w:t>
+      </w:r>
+    </w:p>
+    <w:p/>
+    <w:p>
+      <w:pPr>
+        <w:pStyle w:val="ListParagraph"/>
+        <w:ind w:left="1440"/>
+      </w:pPr>
+    </w:p>
+    <w:p>
+      <w:r>
+        <w:t xml:space="preserve">      Technology Stack:</w:t>
+      </w:r>
+    </w:p>
+    <w:p>
+      <w:pPr>
+        <w:pStyle w:val="ListParagraph"/>
+        <w:numPr>
+          <w:ilvl w:val="0"/>
+          <w:numId w:val="5"/>
+        </w:numPr>
+      </w:pPr>
+      <w:r>
+        <w:t>Programming Language: Python</w:t>
+      </w:r>
+    </w:p>
+    <w:p>
+      <w:pPr>
+        <w:pStyle w:val="ListParagraph"/>
+        <w:numPr>
+          <w:ilvl w:val="0"/>
+          <w:numId w:val="5"/>
+        </w:numPr>
+      </w:pPr>
+      <w:r>
+        <w:t>Frameworks: PyTorch for model inference and NumPy for image manipulation</w:t>
+      </w:r>
+    </w:p>
+    <w:p>
+      <w:pPr>
+        <w:pStyle w:val="ListParagraph"/>
+        <w:numPr>
+          <w:ilvl w:val="0"/>
+          <w:numId w:val="5"/>
+        </w:numPr>
+      </w:pPr>
+      <w:r>
+        <w:lastRenderedPageBreak/>
+        <w:t>Versioning: The project will utilize GitLab for version control and bug tracking</w:t>
+      </w:r>
+    </w:p>
+    <w:p>
+      <w:pPr>
+        <w:ind w:left="360"/>
+      </w:pPr>
+    </w:p>
+    <w:p>
+      <w:pPr>
+        <w:pStyle w:val="ListParagraph"/>
+        <w:numPr>
+          <w:ilvl w:val="1"/>
           <w:numId w:val="3"/>
         </w:numPr>
         <w:rPr>
@@ -1069,12 +1434,20 @@
           <w:sz w:val="32"/>
           <w:szCs w:val="32"/>
         </w:rPr>
-        <w:t>Timeline &amp; Milestones</w:t>
-      </w:r>
-    </w:p>
-    <w:p>
-      <w:pPr>
-        <w:pStyle w:val="ListParagraph"/>
+        <w:t xml:space="preserve">Implementation Pipeline </w:t>
+      </w:r>
+    </w:p>
+    <w:p>
+      <w:pPr>
+        <w:ind w:left="360"/>
+      </w:pPr>
+      <w:r>
+        <w:t>The data flow of the application follows a linear, modular pipeline:</w:t>
+      </w:r>
+    </w:p>
+    <w:p>
+      <w:pPr>
+        <w:ind w:left="360"/>
         <w:rPr>
           <w:b/>
           <w:bCs/>
@@ -1086,8 +1459,1383 @@
     </w:p>
     <w:tbl>
       <w:tblPr>
+        <w:tblStyle w:val="TableGrid"/>
+        <w:tblW w:w="9715" w:type="dxa"/>
+        <w:tblInd w:w="411" w:type="dxa"/>
+        <w:tblLook w:val="04A0" w:firstRow="1" w:lastRow="0" w:firstColumn="1" w:lastColumn="0" w:noHBand="0" w:noVBand="1"/>
+      </w:tblPr>
+      <w:tblGrid>
+        <w:gridCol w:w="1894"/>
+        <w:gridCol w:w="1844"/>
+        <w:gridCol w:w="1840"/>
+        <w:gridCol w:w="1827"/>
+        <w:gridCol w:w="2310"/>
+      </w:tblGrid>
+      <w:tr>
+        <w:trPr>
+          <w:trHeight w:val="585"/>
+        </w:trPr>
+        <w:tc>
+          <w:tcPr>
+            <w:tcW w:w="1911" w:type="dxa"/>
+          </w:tcPr>
+          <w:p>
+            <w:pPr>
+              <w:rPr>
+                <w:b/>
+                <w:bCs/>
+                <w:color w:val="4C94D8" w:themeColor="text2" w:themeTint="80"/>
+                <w:sz w:val="32"/>
+                <w:szCs w:val="32"/>
+              </w:rPr>
+            </w:pPr>
+            <w:r>
+              <w:rPr>
+                <w:b/>
+                <w:bCs/>
+              </w:rPr>
+              <w:t>Pipeline Step</w:t>
+            </w:r>
+          </w:p>
+        </w:tc>
+        <w:tc>
+          <w:tcPr>
+            <w:tcW w:w="1884" w:type="dxa"/>
+          </w:tcPr>
+          <w:p>
+            <w:pPr>
+              <w:rPr>
+                <w:b/>
+                <w:bCs/>
+                <w:color w:val="4C94D8" w:themeColor="text2" w:themeTint="80"/>
+                <w:sz w:val="32"/>
+                <w:szCs w:val="32"/>
+              </w:rPr>
+            </w:pPr>
+            <w:r>
+              <w:rPr>
+                <w:b/>
+                <w:bCs/>
+              </w:rPr>
+              <w:t>Module Name</w:t>
+            </w:r>
+            <w:r>
+              <w:rPr>
+                <w:b/>
+                <w:bCs/>
+                <w:color w:val="4C94D8" w:themeColor="text2" w:themeTint="80"/>
+                <w:sz w:val="32"/>
+                <w:szCs w:val="32"/>
+              </w:rPr>
+              <w:t xml:space="preserve"> </w:t>
+            </w:r>
+          </w:p>
+        </w:tc>
+        <w:tc>
+          <w:tcPr>
+            <w:tcW w:w="1882" w:type="dxa"/>
+          </w:tcPr>
+          <w:p>
+            <w:pPr>
+              <w:rPr>
+                <w:b/>
+                <w:bCs/>
+              </w:rPr>
+            </w:pPr>
+            <w:r>
+              <w:rPr>
+                <w:b/>
+                <w:bCs/>
+              </w:rPr>
+              <w:t xml:space="preserve">Input </w:t>
+            </w:r>
+          </w:p>
+        </w:tc>
+        <w:tc>
+          <w:tcPr>
+            <w:tcW w:w="1875" w:type="dxa"/>
+          </w:tcPr>
+          <w:p>
+            <w:pPr>
+              <w:rPr>
+                <w:b/>
+                <w:bCs/>
+              </w:rPr>
+            </w:pPr>
+            <w:r>
+              <w:rPr>
+                <w:b/>
+                <w:bCs/>
+              </w:rPr>
+              <w:t xml:space="preserve">Output </w:t>
+            </w:r>
+          </w:p>
+        </w:tc>
+        <w:tc>
+          <w:tcPr>
+            <w:tcW w:w="2163" w:type="dxa"/>
+          </w:tcPr>
+          <w:p>
+            <w:pPr>
+              <w:rPr>
+                <w:b/>
+                <w:bCs/>
+              </w:rPr>
+            </w:pPr>
+            <w:r>
+              <w:rPr>
+                <w:b/>
+                <w:bCs/>
+              </w:rPr>
+              <w:t>Description</w:t>
+            </w:r>
+          </w:p>
+        </w:tc>
+      </w:tr>
+      <w:tr>
+        <w:trPr>
+          <w:trHeight w:val="390"/>
+        </w:trPr>
+        <w:tc>
+          <w:tcPr>
+            <w:tcW w:w="1911" w:type="dxa"/>
+          </w:tcPr>
+          <w:p>
+            <w:pPr>
+              <w:rPr>
+                <w:b/>
+                <w:bCs/>
+              </w:rPr>
+            </w:pPr>
+            <w:r>
+              <w:rPr>
+                <w:b/>
+                <w:bCs/>
+              </w:rPr>
+              <w:t>Data Ingestion</w:t>
+            </w:r>
+          </w:p>
+        </w:tc>
+        <w:tc>
+          <w:tcPr>
+            <w:tcW w:w="1884" w:type="dxa"/>
+          </w:tcPr>
+          <w:p>
+            <w:pPr>
+              <w:rPr>
+                <w:b/>
+                <w:bCs/>
+                <w:color w:val="4C94D8" w:themeColor="text2" w:themeTint="80"/>
+                <w:sz w:val="26"/>
+                <w:szCs w:val="26"/>
+              </w:rPr>
+            </w:pPr>
+            <w:r>
+              <w:rPr>
+                <w:rFonts w:ascii="-webkit-standard" w:hAnsi="-webkit-standard"/>
+                <w:color w:val="000000"/>
+                <w:sz w:val="26"/>
+                <w:szCs w:val="26"/>
+              </w:rPr>
+              <w:t>Loader</w:t>
+            </w:r>
+          </w:p>
+        </w:tc>
+        <w:tc>
+          <w:tcPr>
+            <w:tcW w:w="1882" w:type="dxa"/>
+          </w:tcPr>
+          <w:p>
+            <w:pPr>
+              <w:rPr>
+                <w:b/>
+                <w:bCs/>
+                <w:color w:val="4C94D8" w:themeColor="text2" w:themeTint="80"/>
+                <w:sz w:val="32"/>
+                <w:szCs w:val="32"/>
+              </w:rPr>
+            </w:pPr>
+            <w:r>
+              <w:t>Directory Path</w:t>
+            </w:r>
+          </w:p>
+        </w:tc>
+        <w:tc>
+          <w:tcPr>
+            <w:tcW w:w="1875" w:type="dxa"/>
+          </w:tcPr>
+          <w:p>
+            <w:r>
+              <w:t xml:space="preserve">Tensor </w:t>
+            </w:r>
+          </w:p>
+          <w:p>
+            <w:r>
+              <w:t>[T, C, H, W]</w:t>
+            </w:r>
+          </w:p>
+        </w:tc>
+        <w:tc>
+          <w:tcPr>
+            <w:tcW w:w="2163" w:type="dxa"/>
+          </w:tcPr>
+          <w:p>
+            <w:r>
+              <w:t>Loads images from TRAgen and normalizes intensity.</w:t>
+            </w:r>
+          </w:p>
+          <w:p>
+            <w:pPr>
+              <w:rPr>
+                <w:sz w:val="32"/>
+                <w:szCs w:val="32"/>
+              </w:rPr>
+            </w:pPr>
+          </w:p>
+        </w:tc>
+      </w:tr>
+      <w:tr>
+        <w:trPr>
+          <w:trHeight w:val="390"/>
+        </w:trPr>
+        <w:tc>
+          <w:tcPr>
+            <w:tcW w:w="1911" w:type="dxa"/>
+          </w:tcPr>
+          <w:p>
+            <w:pPr>
+              <w:rPr>
+                <w:b/>
+                <w:bCs/>
+              </w:rPr>
+            </w:pPr>
+            <w:r>
+              <w:rPr>
+                <w:b/>
+                <w:bCs/>
+              </w:rPr>
+              <w:t>Initialization</w:t>
+            </w:r>
+          </w:p>
+        </w:tc>
+        <w:tc>
+          <w:tcPr>
+            <w:tcW w:w="1884" w:type="dxa"/>
+          </w:tcPr>
+          <w:p>
+            <w:pPr>
+              <w:rPr>
+                <w:b/>
+                <w:bCs/>
+                <w:color w:val="4C94D8" w:themeColor="text2" w:themeTint="80"/>
+                <w:sz w:val="32"/>
+                <w:szCs w:val="32"/>
+              </w:rPr>
+            </w:pPr>
+            <w:r>
+              <w:rPr>
+                <w:rFonts w:ascii="-webkit-standard" w:hAnsi="-webkit-standard"/>
+                <w:color w:val="000000"/>
+                <w:sz w:val="27"/>
+                <w:szCs w:val="27"/>
+              </w:rPr>
+              <w:t>I</w:t>
+            </w:r>
+            <w:r>
+              <w:rPr>
+                <w:rFonts w:ascii="-webkit-standard" w:hAnsi="-webkit-standard"/>
+                <w:color w:val="000000"/>
+                <w:sz w:val="26"/>
+                <w:szCs w:val="26"/>
+              </w:rPr>
+              <w:t>nitUI</w:t>
+            </w:r>
+          </w:p>
+        </w:tc>
+        <w:tc>
+          <w:tcPr>
+            <w:tcW w:w="1882" w:type="dxa"/>
+          </w:tcPr>
+          <w:p>
+            <w:pPr>
+              <w:rPr>
+                <w:b/>
+                <w:bCs/>
+                <w:color w:val="4C94D8" w:themeColor="text2" w:themeTint="80"/>
+                <w:sz w:val="32"/>
+                <w:szCs w:val="32"/>
+              </w:rPr>
+            </w:pPr>
+            <w:r>
+              <w:t xml:space="preserve">User </w:t>
+            </w:r>
+            <w:r>
+              <w:t>Clicks</w:t>
+            </w:r>
+            <w:r>
+              <w:rPr>
+                <w:b/>
+                <w:bCs/>
+                <w:color w:val="4C94D8" w:themeColor="text2" w:themeTint="80"/>
+                <w:sz w:val="32"/>
+                <w:szCs w:val="32"/>
+              </w:rPr>
+              <w:t xml:space="preserve"> </w:t>
+            </w:r>
+          </w:p>
+        </w:tc>
+        <w:tc>
+          <w:tcPr>
+            <w:tcW w:w="1875" w:type="dxa"/>
+          </w:tcPr>
+          <w:p>
+            <w:r>
+              <w:t xml:space="preserve">Binary Mask </w:t>
+            </w:r>
+          </w:p>
+          <w:p>
+            <w:r>
+              <w:t>[1, H, W]</w:t>
+            </w:r>
+          </w:p>
+        </w:tc>
+        <w:tc>
+          <w:tcPr>
+            <w:tcW w:w="2163" w:type="dxa"/>
+          </w:tcPr>
+          <w:p>
+            <w:pPr>
+              <w:rPr>
+                <w:b/>
+                <w:bCs/>
+                <w:color w:val="4C94D8" w:themeColor="text2" w:themeTint="80"/>
+                <w:sz w:val="32"/>
+                <w:szCs w:val="32"/>
+              </w:rPr>
+            </w:pPr>
+            <w:r>
+              <w:t>Converts user-drawn shapes into a binary matrix for Frame 0.</w:t>
+            </w:r>
+          </w:p>
+        </w:tc>
+      </w:tr>
+      <w:tr>
+        <w:trPr>
+          <w:trHeight w:val="390"/>
+        </w:trPr>
+        <w:tc>
+          <w:tcPr>
+            <w:tcW w:w="1911" w:type="dxa"/>
+          </w:tcPr>
+          <w:p>
+            <w:pPr>
+              <w:rPr>
+                <w:b/>
+                <w:bCs/>
+              </w:rPr>
+            </w:pPr>
+            <w:r>
+              <w:rPr>
+                <w:b/>
+                <w:bCs/>
+              </w:rPr>
+              <w:t>Propagation</w:t>
+            </w:r>
+          </w:p>
+        </w:tc>
+        <w:tc>
+          <w:tcPr>
+            <w:tcW w:w="1884" w:type="dxa"/>
+          </w:tcPr>
+          <w:p>
+            <w:pPr>
+              <w:rPr>
+                <w:b/>
+                <w:bCs/>
+                <w:color w:val="4C94D8" w:themeColor="text2" w:themeTint="80"/>
+              </w:rPr>
+            </w:pPr>
+            <w:r>
+              <w:t>F</w:t>
+            </w:r>
+            <w:r>
+              <w:t>unction</w:t>
+            </w:r>
+            <w:r>
+              <w:t xml:space="preserve"> </w:t>
+            </w:r>
+            <w:r>
+              <w:t>Segment</w:t>
+            </w:r>
+          </w:p>
+        </w:tc>
+        <w:tc>
+          <w:tcPr>
+            <w:tcW w:w="1882" w:type="dxa"/>
+          </w:tcPr>
+          <w:p>
+            <w:pPr>
+              <w:rPr>
+                <w:b/>
+                <w:bCs/>
+                <w:color w:val="4C94D8" w:themeColor="text2" w:themeTint="80"/>
+                <w:sz w:val="32"/>
+                <w:szCs w:val="32"/>
+              </w:rPr>
+            </w:pPr>
+            <w:r>
+              <w:t>Frame (t + 1) + Mask(t)</w:t>
+            </w:r>
+            <w:r>
+              <w:rPr>
+                <w:b/>
+                <w:bCs/>
+                <w:color w:val="4C94D8" w:themeColor="text2" w:themeTint="80"/>
+                <w:sz w:val="32"/>
+                <w:szCs w:val="32"/>
+              </w:rPr>
+              <w:t xml:space="preserve"> </w:t>
+            </w:r>
+          </w:p>
+        </w:tc>
+        <w:tc>
+          <w:tcPr>
+            <w:tcW w:w="1875" w:type="dxa"/>
+          </w:tcPr>
+          <w:p>
+            <w:pPr>
+              <w:rPr>
+                <w:b/>
+                <w:bCs/>
+                <w:color w:val="4C94D8" w:themeColor="text2" w:themeTint="80"/>
+                <w:sz w:val="32"/>
+                <w:szCs w:val="32"/>
+              </w:rPr>
+            </w:pPr>
+            <w:r>
+              <w:t>Mask (t + 1)</w:t>
+            </w:r>
+            <w:r>
+              <w:rPr>
+                <w:b/>
+                <w:bCs/>
+                <w:color w:val="4C94D8" w:themeColor="text2" w:themeTint="80"/>
+                <w:sz w:val="32"/>
+                <w:szCs w:val="32"/>
+              </w:rPr>
+              <w:t xml:space="preserve"> </w:t>
+            </w:r>
+          </w:p>
+        </w:tc>
+        <w:tc>
+          <w:tcPr>
+            <w:tcW w:w="2163" w:type="dxa"/>
+          </w:tcPr>
+          <w:p>
+            <w:pPr>
+              <w:rPr>
+                <w:b/>
+                <w:bCs/>
+                <w:color w:val="4C94D8" w:themeColor="text2" w:themeTint="80"/>
+                <w:sz w:val="32"/>
+                <w:szCs w:val="32"/>
+              </w:rPr>
+            </w:pPr>
+            <w:r>
+              <w:t>Uses a deep network (e.g., ResNet-based encoder) to predict the new mask boundaries.</w:t>
+            </w:r>
+          </w:p>
+        </w:tc>
+      </w:tr>
+      <w:tr>
+        <w:trPr>
+          <w:trHeight w:val="390"/>
+        </w:trPr>
+        <w:tc>
+          <w:tcPr>
+            <w:tcW w:w="1911" w:type="dxa"/>
+          </w:tcPr>
+          <w:p>
+            <w:pPr>
+              <w:rPr>
+                <w:b/>
+                <w:bCs/>
+              </w:rPr>
+            </w:pPr>
+            <w:r>
+              <w:rPr>
+                <w:b/>
+                <w:bCs/>
+              </w:rPr>
+              <w:t xml:space="preserve">ID Tracking </w:t>
+            </w:r>
+          </w:p>
+        </w:tc>
+        <w:tc>
+          <w:tcPr>
+            <w:tcW w:w="1884" w:type="dxa"/>
+          </w:tcPr>
+          <w:p>
+            <w:pPr>
+              <w:rPr>
+                <w:rFonts w:ascii="-webkit-standard" w:hAnsi="-webkit-standard"/>
+                <w:color w:val="000000"/>
+                <w:sz w:val="26"/>
+                <w:szCs w:val="26"/>
+              </w:rPr>
+            </w:pPr>
+            <w:r>
+              <w:rPr>
+                <w:rFonts w:ascii="-webkit-standard" w:hAnsi="-webkit-standard"/>
+                <w:color w:val="000000"/>
+                <w:sz w:val="26"/>
+                <w:szCs w:val="26"/>
+              </w:rPr>
+              <w:t>Tracker</w:t>
+            </w:r>
+          </w:p>
+        </w:tc>
+        <w:tc>
+          <w:tcPr>
+            <w:tcW w:w="1882" w:type="dxa"/>
+          </w:tcPr>
+          <w:p>
+            <w:pPr>
+              <w:rPr>
+                <w:b/>
+                <w:bCs/>
+                <w:color w:val="4C94D8" w:themeColor="text2" w:themeTint="80"/>
+                <w:sz w:val="32"/>
+                <w:szCs w:val="32"/>
+              </w:rPr>
+            </w:pPr>
+            <w:r>
+              <w:t>Mask(t + 1)</w:t>
+            </w:r>
+          </w:p>
+        </w:tc>
+        <w:tc>
+          <w:tcPr>
+            <w:tcW w:w="1875" w:type="dxa"/>
+          </w:tcPr>
+          <w:p>
+            <w:r>
+              <w:t xml:space="preserve">Labeled Mask </w:t>
+            </w:r>
+          </w:p>
+          <w:p>
+            <w:r>
+              <w:t xml:space="preserve">(t + 1) </w:t>
+            </w:r>
+          </w:p>
+        </w:tc>
+        <w:tc>
+          <w:tcPr>
+            <w:tcW w:w="2163" w:type="dxa"/>
+          </w:tcPr>
+          <w:p>
+            <w:r>
+              <w:t>Manages cell IDs and detects Mitosis (cell division).</w:t>
+            </w:r>
+          </w:p>
+        </w:tc>
+      </w:tr>
+      <w:tr>
+        <w:trPr>
+          <w:trHeight w:val="366"/>
+        </w:trPr>
+        <w:tc>
+          <w:tcPr>
+            <w:tcW w:w="1911" w:type="dxa"/>
+          </w:tcPr>
+          <w:p>
+            <w:pPr>
+              <w:rPr>
+                <w:b/>
+                <w:bCs/>
+              </w:rPr>
+            </w:pPr>
+            <w:r>
+              <w:rPr>
+                <w:b/>
+                <w:bCs/>
+              </w:rPr>
+              <w:t xml:space="preserve">Data Export </w:t>
+            </w:r>
+          </w:p>
+        </w:tc>
+        <w:tc>
+          <w:tcPr>
+            <w:tcW w:w="1884" w:type="dxa"/>
+          </w:tcPr>
+          <w:p>
+            <w:pPr>
+              <w:rPr>
+                <w:b/>
+                <w:bCs/>
+                <w:color w:val="4C94D8" w:themeColor="text2" w:themeTint="80"/>
+                <w:sz w:val="32"/>
+                <w:szCs w:val="32"/>
+              </w:rPr>
+            </w:pPr>
+            <w:r>
+              <w:rPr>
+                <w:rFonts w:ascii="-webkit-standard" w:hAnsi="-webkit-standard"/>
+                <w:color w:val="000000"/>
+                <w:sz w:val="26"/>
+                <w:szCs w:val="26"/>
+              </w:rPr>
+              <w:t>Exporter</w:t>
+            </w:r>
+          </w:p>
+        </w:tc>
+        <w:tc>
+          <w:tcPr>
+            <w:tcW w:w="1882" w:type="dxa"/>
+          </w:tcPr>
+          <w:p>
+            <w:pPr>
+              <w:rPr>
+                <w:b/>
+                <w:bCs/>
+                <w:color w:val="4C94D8" w:themeColor="text2" w:themeTint="80"/>
+                <w:sz w:val="32"/>
+                <w:szCs w:val="32"/>
+              </w:rPr>
+            </w:pPr>
+            <w:r>
+              <w:t>All Masks</w:t>
+            </w:r>
+            <w:r>
+              <w:rPr>
+                <w:b/>
+                <w:bCs/>
+                <w:color w:val="4C94D8" w:themeColor="text2" w:themeTint="80"/>
+                <w:sz w:val="32"/>
+                <w:szCs w:val="32"/>
+              </w:rPr>
+              <w:t xml:space="preserve"> </w:t>
+            </w:r>
+          </w:p>
+        </w:tc>
+        <w:tc>
+          <w:tcPr>
+            <w:tcW w:w="1875" w:type="dxa"/>
+          </w:tcPr>
+          <w:p>
+            <w:r>
+              <w:t xml:space="preserve">.PNG / </w:t>
+            </w:r>
+            <w:r>
+              <w:t>.</w:t>
+            </w:r>
+            <w:r>
+              <w:t xml:space="preserve">CSV Files </w:t>
+            </w:r>
+          </w:p>
+        </w:tc>
+        <w:tc>
+          <w:tcPr>
+            <w:tcW w:w="2163" w:type="dxa"/>
+          </w:tcPr>
+          <w:p>
+            <w:pPr>
+              <w:rPr>
+                <w:b/>
+                <w:bCs/>
+                <w:color w:val="4C94D8" w:themeColor="text2" w:themeTint="80"/>
+                <w:sz w:val="32"/>
+                <w:szCs w:val="32"/>
+              </w:rPr>
+            </w:pPr>
+            <w:r>
+              <w:t>Saves the segmentation results and cell trajectories.</w:t>
+            </w:r>
+          </w:p>
+        </w:tc>
+      </w:tr>
+    </w:tbl>
+    <w:p/>
+    <w:p>
+      <w:pPr>
+        <w:ind w:left="360"/>
+        <w:rPr>
+          <w:b/>
+          <w:bCs/>
+          <w:color w:val="4C94D8" w:themeColor="text2" w:themeTint="80"/>
+          <w:sz w:val="32"/>
+          <w:szCs w:val="32"/>
+        </w:rPr>
+      </w:pPr>
+    </w:p>
+    <w:p>
+      <w:pPr>
+        <w:pStyle w:val="ListParagraph"/>
+        <w:numPr>
+          <w:ilvl w:val="1"/>
+          <w:numId w:val="3"/>
+        </w:numPr>
+        <w:rPr>
+          <w:b/>
+          <w:bCs/>
+          <w:color w:val="4C94D8" w:themeColor="text2" w:themeTint="80"/>
+          <w:sz w:val="32"/>
+          <w:szCs w:val="32"/>
+        </w:rPr>
+      </w:pPr>
+      <w:r>
+        <w:rPr>
+          <w:b/>
+          <w:bCs/>
+          <w:color w:val="4C94D8" w:themeColor="text2" w:themeTint="80"/>
+          <w:sz w:val="32"/>
+          <w:szCs w:val="32"/>
+        </w:rPr>
+        <w:t xml:space="preserve">Core Functionality </w:t>
+      </w:r>
+    </w:p>
+    <w:p>
+      <w:pPr>
+        <w:pStyle w:val="ListParagraph"/>
+        <w:numPr>
+          <w:ilvl w:val="0"/>
+          <w:numId w:val="5"/>
+        </w:numPr>
+      </w:pPr>
+      <w:r>
+        <w:rPr>
+          <w:b/>
+          <w:bCs/>
+        </w:rPr>
+        <w:t>f</w:t>
+      </w:r>
+      <w:r>
+        <w:rPr>
+          <w:b/>
+          <w:bCs/>
+        </w:rPr>
+        <w:t>unction Segment:</w:t>
+      </w:r>
+      <w:r>
+        <w:t xml:space="preserve"> This module will wrap a pre-trained deep neural network. It takes the previous frame’s mask as a prior and performs a pixel-wise classification on the current frame to define the new cell boundary </w:t>
+      </w:r>
+    </w:p>
+    <w:p>
+      <w:pPr>
+        <w:pStyle w:val="ListParagraph"/>
+        <w:numPr>
+          <w:ilvl w:val="0"/>
+          <w:numId w:val="5"/>
+        </w:numPr>
+      </w:pPr>
+      <w:r>
+        <w:rPr>
+          <w:b/>
+          <w:bCs/>
+        </w:rPr>
+        <w:t>Funtion Evaluate:</w:t>
+      </w:r>
+      <w:r>
+        <w:t xml:space="preserve"> This function will compare the final </w:t>
+      </w:r>
+      <w:r>
+        <w:rPr>
+          <w:b/>
+          <w:bCs/>
+        </w:rPr>
+        <w:t>Labeled Masks</w:t>
+      </w:r>
+      <w:r>
+        <w:t xml:space="preserve"> against the TRAgen ground truth to calculate the Tracking Accuracy </w:t>
+      </w:r>
+    </w:p>
+    <w:p/>
+    <w:p/>
+    <w:p/>
+    <w:p/>
+    <w:p>
+      <w:pPr>
+        <w:pStyle w:val="ListParagraph"/>
+        <w:numPr>
+          <w:ilvl w:val="0"/>
+          <w:numId w:val="3"/>
+        </w:numPr>
+        <w:rPr>
+          <w:b/>
+          <w:bCs/>
+          <w:color w:val="4C94D8" w:themeColor="text2" w:themeTint="80"/>
+          <w:sz w:val="32"/>
+          <w:szCs w:val="32"/>
+        </w:rPr>
+      </w:pPr>
+      <w:r>
+        <w:rPr>
+          <w:b/>
+          <w:bCs/>
+          <w:color w:val="4C94D8" w:themeColor="text2" w:themeTint="80"/>
+          <w:sz w:val="32"/>
+          <w:szCs w:val="32"/>
+        </w:rPr>
+        <w:lastRenderedPageBreak/>
+        <w:t>Processing Pipeline</w:t>
+      </w:r>
+    </w:p>
+    <w:p>
+      <w:pPr>
+        <w:pStyle w:val="ListParagraph"/>
+      </w:pPr>
+      <w:r>
+        <w:t>The application processes a microscopy sequence using the following pipeline:</w:t>
+      </w:r>
+    </w:p>
+    <w:p>
+      <w:pPr>
+        <w:pStyle w:val="ListParagraph"/>
+      </w:pPr>
+    </w:p>
+    <w:p>
+      <w:pPr>
+        <w:pStyle w:val="ListParagraph"/>
+        <w:numPr>
+          <w:ilvl w:val="0"/>
+          <w:numId w:val="11"/>
+        </w:numPr>
+        <w:rPr>
+          <w:b/>
+          <w:bCs/>
+        </w:rPr>
+      </w:pPr>
+      <w:r>
+        <w:rPr>
+          <w:b/>
+          <w:bCs/>
+        </w:rPr>
+        <w:t>Sequence Import:</w:t>
+      </w:r>
+    </w:p>
+    <w:p>
+      <w:pPr>
+        <w:pStyle w:val="ListParagraph"/>
+        <w:ind w:left="1080"/>
+      </w:pPr>
+      <w:r>
+        <w:t>The user loads a time-lapse microscopy sequence generated by TRAgen. The application supports TIFF stacks or ordered PNG image sequences.</w:t>
+      </w:r>
+    </w:p>
+    <w:p>
+      <w:pPr>
+        <w:pStyle w:val="ListParagraph"/>
+        <w:numPr>
+          <w:ilvl w:val="0"/>
+          <w:numId w:val="11"/>
+        </w:numPr>
+        <w:rPr>
+          <w:b/>
+          <w:bCs/>
+        </w:rPr>
+      </w:pPr>
+      <w:r>
+        <w:rPr>
+          <w:b/>
+          <w:bCs/>
+        </w:rPr>
+        <w:t xml:space="preserve">First Frame initialization </w:t>
+      </w:r>
+    </w:p>
+    <w:p>
+      <w:pPr>
+        <w:pStyle w:val="ListParagraph"/>
+        <w:ind w:left="1080"/>
+      </w:pPr>
+      <w:r>
+        <w:t>The first frame is displayed in the interactive canvas. The user manually an</w:t>
+      </w:r>
+      <w:r>
+        <w:t xml:space="preserve">notates </w:t>
+      </w:r>
+      <w:r>
+        <w:t>visible cells using drawing tools provided by the GUI</w:t>
+      </w:r>
+      <w:r>
+        <w:t>.</w:t>
+      </w:r>
+    </w:p>
+    <w:p>
+      <w:pPr>
+        <w:pStyle w:val="ListParagraph"/>
+        <w:numPr>
+          <w:ilvl w:val="0"/>
+          <w:numId w:val="11"/>
+        </w:numPr>
+      </w:pPr>
+      <w:r>
+        <w:rPr>
+          <w:b/>
+          <w:bCs/>
+        </w:rPr>
+        <w:t xml:space="preserve">Preprocessing </w:t>
+      </w:r>
+    </w:p>
+    <w:p>
+      <w:pPr>
+        <w:pStyle w:val="ListParagraph"/>
+        <w:ind w:left="1080"/>
+      </w:pPr>
+      <w:r>
+        <w:t>Th eloaded frames are normilized and resized if necessary. The initial mask is converted into a binary segmentation mask suitable for model input</w:t>
+      </w:r>
+      <w:r>
+        <w:t>.</w:t>
+      </w:r>
+    </w:p>
+    <w:p>
+      <w:pPr>
+        <w:pStyle w:val="ListParagraph"/>
+        <w:numPr>
+          <w:ilvl w:val="0"/>
+          <w:numId w:val="11"/>
+        </w:numPr>
+        <w:rPr>
+          <w:b/>
+          <w:bCs/>
+        </w:rPr>
+      </w:pPr>
+      <w:r>
+        <w:rPr>
+          <w:b/>
+          <w:bCs/>
+        </w:rPr>
+        <w:t>Segmentation and Propagation</w:t>
+      </w:r>
+    </w:p>
+    <w:p>
+      <w:pPr>
+        <w:pStyle w:val="ListParagraph"/>
+        <w:ind w:left="1080"/>
+      </w:pPr>
+      <w:r>
+        <w:t>For each subsequent frame:</w:t>
+      </w:r>
+    </w:p>
+    <w:p>
+      <w:pPr>
+        <w:pStyle w:val="ListParagraph"/>
+        <w:numPr>
+          <w:ilvl w:val="0"/>
+          <w:numId w:val="5"/>
+        </w:numPr>
+      </w:pPr>
+      <w:r>
+        <w:t>The previous frame mask is used as a spatial prior.</w:t>
+      </w:r>
+    </w:p>
+    <w:p>
+      <w:pPr>
+        <w:pStyle w:val="ListParagraph"/>
+        <w:numPr>
+          <w:ilvl w:val="0"/>
+          <w:numId w:val="5"/>
+        </w:numPr>
+      </w:pPr>
+      <w:r>
+        <w:t>The current frame and previous mask are passed into the segmentation engine.</w:t>
+      </w:r>
+    </w:p>
+    <w:p>
+      <w:pPr>
+        <w:pStyle w:val="ListParagraph"/>
+        <w:numPr>
+          <w:ilvl w:val="0"/>
+          <w:numId w:val="5"/>
+        </w:numPr>
+      </w:pPr>
+      <w:r>
+        <w:t>The model generates an updated segmentation mask for the current frame.</w:t>
+      </w:r>
+    </w:p>
+    <w:p>
+      <w:pPr>
+        <w:pStyle w:val="ListParagraph"/>
+        <w:numPr>
+          <w:ilvl w:val="0"/>
+          <w:numId w:val="11"/>
+        </w:numPr>
+        <w:rPr>
+          <w:b/>
+          <w:bCs/>
+        </w:rPr>
+      </w:pPr>
+      <w:r>
+        <w:rPr>
+          <w:b/>
+          <w:bCs/>
+        </w:rPr>
+        <w:t xml:space="preserve">Tracking and Identity Preservation </w:t>
+      </w:r>
+    </w:p>
+    <w:p>
+      <w:pPr>
+        <w:pStyle w:val="ListParagraph"/>
+        <w:ind w:left="1080"/>
+      </w:pPr>
+      <w:r>
+        <w:t>The tracking module assigns consistent IDs. To segmentated cells across frames and detects events such as:</w:t>
+      </w:r>
+    </w:p>
+    <w:p>
+      <w:pPr>
+        <w:pStyle w:val="ListParagraph"/>
+        <w:numPr>
+          <w:ilvl w:val="0"/>
+          <w:numId w:val="5"/>
+        </w:numPr>
+      </w:pPr>
+      <w:r>
+        <w:t xml:space="preserve">Cell movement </w:t>
+      </w:r>
+    </w:p>
+    <w:p>
+      <w:pPr>
+        <w:pStyle w:val="ListParagraph"/>
+        <w:numPr>
+          <w:ilvl w:val="0"/>
+          <w:numId w:val="5"/>
+        </w:numPr>
+      </w:pPr>
+      <w:r>
+        <w:t xml:space="preserve">Cell growth </w:t>
+      </w:r>
+    </w:p>
+    <w:p>
+      <w:pPr>
+        <w:pStyle w:val="ListParagraph"/>
+        <w:numPr>
+          <w:ilvl w:val="0"/>
+          <w:numId w:val="5"/>
+        </w:numPr>
+      </w:pPr>
+      <w:r>
+        <w:t xml:space="preserve">Cell division (mitosis) </w:t>
+      </w:r>
+    </w:p>
+    <w:p>
+      <w:pPr>
+        <w:pStyle w:val="ListParagraph"/>
+        <w:numPr>
+          <w:ilvl w:val="0"/>
+          <w:numId w:val="11"/>
+        </w:numPr>
+        <w:rPr>
+          <w:b/>
+          <w:bCs/>
+        </w:rPr>
+      </w:pPr>
+      <w:r>
+        <w:rPr>
+          <w:b/>
+          <w:bCs/>
+        </w:rPr>
+        <w:t>Visualization</w:t>
+      </w:r>
+    </w:p>
+    <w:p>
+      <w:pPr>
+        <w:pStyle w:val="ListParagraph"/>
+        <w:ind w:left="1080"/>
+      </w:pPr>
+      <w:r>
+        <w:t>The generated masks are displayed as overlays on top of the microscopy sequence for user verification.</w:t>
+      </w:r>
+    </w:p>
+    <w:p>
+      <w:pPr>
+        <w:pStyle w:val="ListParagraph"/>
+        <w:numPr>
+          <w:ilvl w:val="0"/>
+          <w:numId w:val="11"/>
+        </w:numPr>
+        <w:rPr>
+          <w:b/>
+          <w:bCs/>
+        </w:rPr>
+      </w:pPr>
+      <w:r>
+        <w:rPr>
+          <w:b/>
+          <w:bCs/>
+        </w:rPr>
+        <w:t>Export</w:t>
+      </w:r>
+    </w:p>
+    <w:p>
+      <w:pPr>
+        <w:pStyle w:val="ListParagraph"/>
+        <w:ind w:left="1080"/>
+      </w:pPr>
+      <w:r>
+        <w:t>The final outputs can be exported as:</w:t>
+      </w:r>
+    </w:p>
+    <w:p>
+      <w:pPr>
+        <w:pStyle w:val="ListParagraph"/>
+        <w:numPr>
+          <w:ilvl w:val="0"/>
+          <w:numId w:val="5"/>
+        </w:numPr>
+      </w:pPr>
+      <w:r>
+        <w:t>Binary segmentation masks</w:t>
+      </w:r>
+    </w:p>
+    <w:p>
+      <w:pPr>
+        <w:pStyle w:val="ListParagraph"/>
+        <w:numPr>
+          <w:ilvl w:val="0"/>
+          <w:numId w:val="5"/>
+        </w:numPr>
+      </w:pPr>
+      <w:r>
+        <w:t xml:space="preserve">Overlay visualization videos </w:t>
+      </w:r>
+    </w:p>
+    <w:p>
+      <w:pPr>
+        <w:pStyle w:val="ListParagraph"/>
+        <w:numPr>
+          <w:ilvl w:val="0"/>
+          <w:numId w:val="5"/>
+        </w:numPr>
+      </w:pPr>
+      <w:r>
+        <w:t>Cell trajectory information</w:t>
+      </w:r>
+    </w:p>
+    <w:p>
+      <w:pPr>
+        <w:rPr>
+          <w:b/>
+          <w:bCs/>
+          <w:color w:val="4C94D8" w:themeColor="text2" w:themeTint="80"/>
+          <w:sz w:val="32"/>
+          <w:szCs w:val="32"/>
+        </w:rPr>
+      </w:pPr>
+    </w:p>
+    <w:p>
+      <w:pPr>
+        <w:pStyle w:val="ListParagraph"/>
+        <w:numPr>
+          <w:ilvl w:val="0"/>
+          <w:numId w:val="3"/>
+        </w:numPr>
+        <w:rPr>
+          <w:b/>
+          <w:bCs/>
+          <w:color w:val="4C94D8" w:themeColor="text2" w:themeTint="80"/>
+          <w:sz w:val="32"/>
+          <w:szCs w:val="32"/>
+        </w:rPr>
+      </w:pPr>
+      <w:r>
+        <w:rPr>
+          <w:b/>
+          <w:bCs/>
+          <w:color w:val="4C94D8" w:themeColor="text2" w:themeTint="80"/>
+          <w:sz w:val="32"/>
+          <w:szCs w:val="32"/>
+        </w:rPr>
+        <w:t>System Inputs and Outputs</w:t>
+      </w:r>
+    </w:p>
+    <w:p>
+      <w:pPr>
+        <w:rPr>
+          <w:b/>
+          <w:bCs/>
+          <w:color w:val="4C94D8" w:themeColor="text2" w:themeTint="80"/>
+          <w:sz w:val="32"/>
+          <w:szCs w:val="32"/>
+        </w:rPr>
+      </w:pPr>
+    </w:p>
+    <w:p>
+      <w:pPr>
+        <w:ind w:left="360"/>
+        <w:rPr>
+          <w:b/>
+          <w:bCs/>
+        </w:rPr>
+      </w:pPr>
+      <w:r>
+        <w:rPr>
+          <w:b/>
+          <w:bCs/>
+        </w:rPr>
+        <w:t>Inputs</w:t>
+      </w:r>
+      <w:r>
+        <w:rPr>
+          <w:b/>
+          <w:bCs/>
+        </w:rPr>
+        <w:t>:</w:t>
+      </w:r>
+    </w:p>
+    <w:p>
+      <w:pPr>
+        <w:pStyle w:val="ListParagraph"/>
+        <w:numPr>
+          <w:ilvl w:val="0"/>
+          <w:numId w:val="5"/>
+        </w:numPr>
+      </w:pPr>
+      <w:r>
+        <w:t>Time</w:t>
+      </w:r>
+      <w:r>
+        <w:t xml:space="preserve">-lapse microscopy sequences generated by TRAgen </w:t>
+      </w:r>
+    </w:p>
+    <w:p>
+      <w:pPr>
+        <w:pStyle w:val="ListParagraph"/>
+        <w:numPr>
+          <w:ilvl w:val="0"/>
+          <w:numId w:val="5"/>
+        </w:numPr>
+      </w:pPr>
+      <w:r>
+        <w:t xml:space="preserve">TIFF stacks or PNG image sequences </w:t>
+      </w:r>
+    </w:p>
+    <w:p>
+      <w:pPr>
+        <w:pStyle w:val="ListParagraph"/>
+        <w:numPr>
+          <w:ilvl w:val="0"/>
+          <w:numId w:val="5"/>
+        </w:numPr>
+      </w:pPr>
+      <w:r>
+        <w:t xml:space="preserve">User-provided first-frame annotation masks </w:t>
+      </w:r>
+    </w:p>
+    <w:p>
+      <w:pPr>
+        <w:pStyle w:val="ListParagraph"/>
+        <w:ind w:left="1440"/>
+      </w:pPr>
+    </w:p>
+    <w:p>
+      <w:r>
+        <w:t xml:space="preserve">     Outputs:</w:t>
+      </w:r>
+    </w:p>
+    <w:p>
+      <w:pPr>
+        <w:pStyle w:val="ListParagraph"/>
+        <w:numPr>
+          <w:ilvl w:val="0"/>
+          <w:numId w:val="5"/>
+        </w:numPr>
+      </w:pPr>
+      <w:r>
+        <w:t xml:space="preserve">Segmentation masks for all frames </w:t>
+      </w:r>
+    </w:p>
+    <w:p>
+      <w:pPr>
+        <w:pStyle w:val="ListParagraph"/>
+        <w:numPr>
+          <w:ilvl w:val="0"/>
+          <w:numId w:val="5"/>
+        </w:numPr>
+      </w:pPr>
+      <w:r>
+        <w:t xml:space="preserve">Overlay visualization videos </w:t>
+      </w:r>
+    </w:p>
+    <w:p>
+      <w:pPr>
+        <w:pStyle w:val="ListParagraph"/>
+        <w:numPr>
+          <w:ilvl w:val="0"/>
+          <w:numId w:val="5"/>
+        </w:numPr>
+      </w:pPr>
+      <w:r>
+        <w:lastRenderedPageBreak/>
+        <w:t xml:space="preserve">Cell trajectory information </w:t>
+      </w:r>
+    </w:p>
+    <w:p>
+      <w:pPr>
+        <w:pStyle w:val="ListParagraph"/>
+        <w:numPr>
+          <w:ilvl w:val="0"/>
+          <w:numId w:val="5"/>
+        </w:numPr>
+      </w:pPr>
+      <w:r>
+        <w:t>Tracking metadata</w:t>
+      </w:r>
+    </w:p>
+    <w:p>
+      <w:pPr>
+        <w:pStyle w:val="ListParagraph"/>
+        <w:numPr>
+          <w:ilvl w:val="0"/>
+          <w:numId w:val="5"/>
+        </w:numPr>
+      </w:pPr>
+      <w:r>
+        <w:t xml:space="preserve">Evaluation metrics against TRAgen ground truth </w:t>
+      </w:r>
+    </w:p>
+    <w:p/>
+    <w:p>
+      <w:pPr>
+        <w:rPr>
+          <w:b/>
+          <w:bCs/>
+          <w:color w:val="4C94D8" w:themeColor="text2" w:themeTint="80"/>
+          <w:sz w:val="32"/>
+          <w:szCs w:val="32"/>
+        </w:rPr>
+      </w:pPr>
+    </w:p>
+    <w:p>
+      <w:pPr>
+        <w:pStyle w:val="ListParagraph"/>
+        <w:numPr>
+          <w:ilvl w:val="0"/>
+          <w:numId w:val="3"/>
+        </w:numPr>
+        <w:rPr>
+          <w:b/>
+          <w:bCs/>
+          <w:color w:val="4C94D8" w:themeColor="text2" w:themeTint="80"/>
+          <w:sz w:val="32"/>
+          <w:szCs w:val="32"/>
+        </w:rPr>
+      </w:pPr>
+      <w:r>
+        <w:rPr>
+          <w:b/>
+          <w:bCs/>
+          <w:color w:val="4C94D8" w:themeColor="text2" w:themeTint="80"/>
+          <w:sz w:val="32"/>
+          <w:szCs w:val="32"/>
+        </w:rPr>
+        <w:t>Timeline and Goals</w:t>
+      </w:r>
+    </w:p>
+    <w:tbl>
+      <w:tblPr>
+        <w:tblpPr w:leftFromText="180" w:rightFromText="180" w:vertAnchor="text" w:horzAnchor="page" w:tblpX="2441" w:tblpY="152"/>
         <w:tblW w:w="9026" w:type="dxa"/>
-        <w:tblInd w:w="338" w:type="dxa"/>
         <w:tblBorders>
           <w:top w:val="single" w:sz="4" w:space="0" w:color="auto"/>
           <w:left w:val="single" w:sz="4" w:space="0" w:color="auto"/>
@@ -1210,10 +2958,7 @@
           </w:tcPr>
           <w:p>
             <w:r>
-              <w:t xml:space="preserve">March </w:t>
-            </w:r>
-            <w:r>
-              <w:t>2026</w:t>
+              <w:t>March 2026</w:t>
             </w:r>
           </w:p>
         </w:tc>
@@ -1610,34 +3355,6 @@
     </w:p>
     <w:p>
       <w:pPr>
-        <w:pStyle w:val="ListParagraph"/>
-        <w:numPr>
-          <w:ilvl w:val="0"/>
-          <w:numId w:val="3"/>
-        </w:numPr>
-        <w:rPr>
-          <w:b/>
-          <w:bCs/>
-          <w:color w:val="4C94D8" w:themeColor="text2" w:themeTint="80"/>
-          <w:sz w:val="32"/>
-          <w:szCs w:val="32"/>
-        </w:rPr>
-      </w:pPr>
-    </w:p>
-    <w:p>
-      <w:pPr>
-        <w:pStyle w:val="ListParagraph"/>
-        <w:rPr>
-          <w:b/>
-          <w:bCs/>
-          <w:color w:val="4C94D8" w:themeColor="text2" w:themeTint="80"/>
-          <w:sz w:val="32"/>
-          <w:szCs w:val="32"/>
-        </w:rPr>
-      </w:pPr>
-    </w:p>
-    <w:p>
-      <w:pPr>
         <w:rPr>
           <w:b/>
           <w:bCs/>
@@ -1987,6 +3704,184 @@
     </w:lvl>
   </w:abstractNum>
   <w:abstractNum w:abstractNumId="3" w15:restartNumberingAfterBreak="0">
+    <w:nsid w:val="1D2F42EE"/>
+    <w:multiLevelType w:val="hybridMultilevel"/>
+    <w:tmpl w:val="9DBE096C"/>
+    <w:lvl w:ilvl="0" w:tplc="218EBFA4">
+      <w:start w:val="1"/>
+      <w:numFmt w:val="decimal"/>
+      <w:lvlText w:val="%1)"/>
+      <w:lvlJc w:val="left"/>
+      <w:pPr>
+        <w:ind w:left="1080" w:hanging="360"/>
+      </w:pPr>
+      <w:rPr>
+        <w:rFonts w:hint="default"/>
+      </w:rPr>
+    </w:lvl>
+    <w:lvl w:ilvl="1" w:tplc="04090019" w:tentative="1">
+      <w:start w:val="1"/>
+      <w:numFmt w:val="lowerLetter"/>
+      <w:lvlText w:val="%2."/>
+      <w:lvlJc w:val="left"/>
+      <w:pPr>
+        <w:ind w:left="1800" w:hanging="360"/>
+      </w:pPr>
+    </w:lvl>
+    <w:lvl w:ilvl="2" w:tplc="0409001B" w:tentative="1">
+      <w:start w:val="1"/>
+      <w:numFmt w:val="lowerRoman"/>
+      <w:lvlText w:val="%3."/>
+      <w:lvlJc w:val="right"/>
+      <w:pPr>
+        <w:ind w:left="2520" w:hanging="180"/>
+      </w:pPr>
+    </w:lvl>
+    <w:lvl w:ilvl="3" w:tplc="0409000F" w:tentative="1">
+      <w:start w:val="1"/>
+      <w:numFmt w:val="decimal"/>
+      <w:lvlText w:val="%4."/>
+      <w:lvlJc w:val="left"/>
+      <w:pPr>
+        <w:ind w:left="3240" w:hanging="360"/>
+      </w:pPr>
+    </w:lvl>
+    <w:lvl w:ilvl="4" w:tplc="04090019" w:tentative="1">
+      <w:start w:val="1"/>
+      <w:numFmt w:val="lowerLetter"/>
+      <w:lvlText w:val="%5."/>
+      <w:lvlJc w:val="left"/>
+      <w:pPr>
+        <w:ind w:left="3960" w:hanging="360"/>
+      </w:pPr>
+    </w:lvl>
+    <w:lvl w:ilvl="5" w:tplc="0409001B" w:tentative="1">
+      <w:start w:val="1"/>
+      <w:numFmt w:val="lowerRoman"/>
+      <w:lvlText w:val="%6."/>
+      <w:lvlJc w:val="right"/>
+      <w:pPr>
+        <w:ind w:left="4680" w:hanging="180"/>
+      </w:pPr>
+    </w:lvl>
+    <w:lvl w:ilvl="6" w:tplc="0409000F" w:tentative="1">
+      <w:start w:val="1"/>
+      <w:numFmt w:val="decimal"/>
+      <w:lvlText w:val="%7."/>
+      <w:lvlJc w:val="left"/>
+      <w:pPr>
+        <w:ind w:left="5400" w:hanging="360"/>
+      </w:pPr>
+    </w:lvl>
+    <w:lvl w:ilvl="7" w:tplc="04090019" w:tentative="1">
+      <w:start w:val="1"/>
+      <w:numFmt w:val="lowerLetter"/>
+      <w:lvlText w:val="%8."/>
+      <w:lvlJc w:val="left"/>
+      <w:pPr>
+        <w:ind w:left="6120" w:hanging="360"/>
+      </w:pPr>
+    </w:lvl>
+    <w:lvl w:ilvl="8" w:tplc="0409001B" w:tentative="1">
+      <w:start w:val="1"/>
+      <w:numFmt w:val="lowerRoman"/>
+      <w:lvlText w:val="%9."/>
+      <w:lvlJc w:val="right"/>
+      <w:pPr>
+        <w:ind w:left="6840" w:hanging="180"/>
+      </w:pPr>
+    </w:lvl>
+  </w:abstractNum>
+  <w:abstractNum w:abstractNumId="4" w15:restartNumberingAfterBreak="0">
+    <w:nsid w:val="2923588A"/>
+    <w:multiLevelType w:val="hybridMultilevel"/>
+    <w:tmpl w:val="532042F8"/>
+    <w:lvl w:ilvl="0" w:tplc="0409000F">
+      <w:start w:val="1"/>
+      <w:numFmt w:val="decimal"/>
+      <w:lvlText w:val="%1."/>
+      <w:lvlJc w:val="left"/>
+      <w:pPr>
+        <w:ind w:left="720" w:hanging="360"/>
+      </w:pPr>
+      <w:rPr>
+        <w:rFonts w:hint="default"/>
+      </w:rPr>
+    </w:lvl>
+    <w:lvl w:ilvl="1" w:tplc="04090019" w:tentative="1">
+      <w:start w:val="1"/>
+      <w:numFmt w:val="lowerLetter"/>
+      <w:lvlText w:val="%2."/>
+      <w:lvlJc w:val="left"/>
+      <w:pPr>
+        <w:ind w:left="1440" w:hanging="360"/>
+      </w:pPr>
+    </w:lvl>
+    <w:lvl w:ilvl="2" w:tplc="0409001B" w:tentative="1">
+      <w:start w:val="1"/>
+      <w:numFmt w:val="lowerRoman"/>
+      <w:lvlText w:val="%3."/>
+      <w:lvlJc w:val="right"/>
+      <w:pPr>
+        <w:ind w:left="2160" w:hanging="180"/>
+      </w:pPr>
+    </w:lvl>
+    <w:lvl w:ilvl="3" w:tplc="0409000F" w:tentative="1">
+      <w:start w:val="1"/>
+      <w:numFmt w:val="decimal"/>
+      <w:lvlText w:val="%4."/>
+      <w:lvlJc w:val="left"/>
+      <w:pPr>
+        <w:ind w:left="2880" w:hanging="360"/>
+      </w:pPr>
+    </w:lvl>
+    <w:lvl w:ilvl="4" w:tplc="04090019" w:tentative="1">
+      <w:start w:val="1"/>
+      <w:numFmt w:val="lowerLetter"/>
+      <w:lvlText w:val="%5."/>
+      <w:lvlJc w:val="left"/>
+      <w:pPr>
+        <w:ind w:left="3600" w:hanging="360"/>
+      </w:pPr>
+    </w:lvl>
+    <w:lvl w:ilvl="5" w:tplc="0409001B" w:tentative="1">
+      <w:start w:val="1"/>
+      <w:numFmt w:val="lowerRoman"/>
+      <w:lvlText w:val="%6."/>
+      <w:lvlJc w:val="right"/>
+      <w:pPr>
+        <w:ind w:left="4320" w:hanging="180"/>
+      </w:pPr>
+    </w:lvl>
+    <w:lvl w:ilvl="6" w:tplc="0409000F" w:tentative="1">
+      <w:start w:val="1"/>
+      <w:numFmt w:val="decimal"/>
+      <w:lvlText w:val="%7."/>
+      <w:lvlJc w:val="left"/>
+      <w:pPr>
+        <w:ind w:left="5040" w:hanging="360"/>
+      </w:pPr>
+    </w:lvl>
+    <w:lvl w:ilvl="7" w:tplc="04090019" w:tentative="1">
+      <w:start w:val="1"/>
+      <w:numFmt w:val="lowerLetter"/>
+      <w:lvlText w:val="%8."/>
+      <w:lvlJc w:val="left"/>
+      <w:pPr>
+        <w:ind w:left="5760" w:hanging="360"/>
+      </w:pPr>
+    </w:lvl>
+    <w:lvl w:ilvl="8" w:tplc="0409001B" w:tentative="1">
+      <w:start w:val="1"/>
+      <w:numFmt w:val="lowerRoman"/>
+      <w:lvlText w:val="%9."/>
+      <w:lvlJc w:val="right"/>
+      <w:pPr>
+        <w:ind w:left="6480" w:hanging="180"/>
+      </w:pPr>
+    </w:lvl>
+  </w:abstractNum>
+  <w:abstractNum w:abstractNumId="5" w15:restartNumberingAfterBreak="0">
     <w:nsid w:val="2B4363D5"/>
     <w:multiLevelType w:val="hybridMultilevel"/>
     <w:tmpl w:val="004CD3A8"/>
@@ -2075,7 +3970,7 @@
       </w:pPr>
     </w:lvl>
   </w:abstractNum>
-  <w:abstractNum w:abstractNumId="4" w15:restartNumberingAfterBreak="0">
+  <w:abstractNum w:abstractNumId="6" w15:restartNumberingAfterBreak="0">
     <w:nsid w:val="36231F8E"/>
     <w:multiLevelType w:val="hybridMultilevel"/>
     <w:tmpl w:val="5600913C"/>
@@ -2188,7 +4083,7 @@
       </w:rPr>
     </w:lvl>
   </w:abstractNum>
-  <w:abstractNum w:abstractNumId="5" w15:restartNumberingAfterBreak="0">
+  <w:abstractNum w:abstractNumId="7" w15:restartNumberingAfterBreak="0">
     <w:nsid w:val="38CB1189"/>
     <w:multiLevelType w:val="hybridMultilevel"/>
     <w:tmpl w:val="F26CC60A"/>
@@ -2301,7 +4196,187 @@
       </w:rPr>
     </w:lvl>
   </w:abstractNum>
-  <w:abstractNum w:abstractNumId="6" w15:restartNumberingAfterBreak="0">
+  <w:abstractNum w:abstractNumId="8" w15:restartNumberingAfterBreak="0">
+    <w:nsid w:val="3FAB433E"/>
+    <w:multiLevelType w:val="hybridMultilevel"/>
+    <w:tmpl w:val="E10631A0"/>
+    <w:lvl w:ilvl="0" w:tplc="0409000F">
+      <w:start w:val="1"/>
+      <w:numFmt w:val="decimal"/>
+      <w:lvlText w:val="%1."/>
+      <w:lvlJc w:val="left"/>
+      <w:pPr>
+        <w:ind w:left="720" w:hanging="360"/>
+      </w:pPr>
+      <w:rPr>
+        <w:rFonts w:hint="default"/>
+      </w:rPr>
+    </w:lvl>
+    <w:lvl w:ilvl="1" w:tplc="04090019" w:tentative="1">
+      <w:start w:val="1"/>
+      <w:numFmt w:val="lowerLetter"/>
+      <w:lvlText w:val="%2."/>
+      <w:lvlJc w:val="left"/>
+      <w:pPr>
+        <w:ind w:left="1440" w:hanging="360"/>
+      </w:pPr>
+    </w:lvl>
+    <w:lvl w:ilvl="2" w:tplc="0409001B" w:tentative="1">
+      <w:start w:val="1"/>
+      <w:numFmt w:val="lowerRoman"/>
+      <w:lvlText w:val="%3."/>
+      <w:lvlJc w:val="right"/>
+      <w:pPr>
+        <w:ind w:left="2160" w:hanging="180"/>
+      </w:pPr>
+    </w:lvl>
+    <w:lvl w:ilvl="3" w:tplc="0409000F" w:tentative="1">
+      <w:start w:val="1"/>
+      <w:numFmt w:val="decimal"/>
+      <w:lvlText w:val="%4."/>
+      <w:lvlJc w:val="left"/>
+      <w:pPr>
+        <w:ind w:left="2880" w:hanging="360"/>
+      </w:pPr>
+    </w:lvl>
+    <w:lvl w:ilvl="4" w:tplc="04090019" w:tentative="1">
+      <w:start w:val="1"/>
+      <w:numFmt w:val="lowerLetter"/>
+      <w:lvlText w:val="%5."/>
+      <w:lvlJc w:val="left"/>
+      <w:pPr>
+        <w:ind w:left="3600" w:hanging="360"/>
+      </w:pPr>
+    </w:lvl>
+    <w:lvl w:ilvl="5" w:tplc="0409001B" w:tentative="1">
+      <w:start w:val="1"/>
+      <w:numFmt w:val="lowerRoman"/>
+      <w:lvlText w:val="%6."/>
+      <w:lvlJc w:val="right"/>
+      <w:pPr>
+        <w:ind w:left="4320" w:hanging="180"/>
+      </w:pPr>
+    </w:lvl>
+    <w:lvl w:ilvl="6" w:tplc="0409000F" w:tentative="1">
+      <w:start w:val="1"/>
+      <w:numFmt w:val="decimal"/>
+      <w:lvlText w:val="%7."/>
+      <w:lvlJc w:val="left"/>
+      <w:pPr>
+        <w:ind w:left="5040" w:hanging="360"/>
+      </w:pPr>
+    </w:lvl>
+    <w:lvl w:ilvl="7" w:tplc="04090019" w:tentative="1">
+      <w:start w:val="1"/>
+      <w:numFmt w:val="lowerLetter"/>
+      <w:lvlText w:val="%8."/>
+      <w:lvlJc w:val="left"/>
+      <w:pPr>
+        <w:ind w:left="5760" w:hanging="360"/>
+      </w:pPr>
+    </w:lvl>
+    <w:lvl w:ilvl="8" w:tplc="0409001B" w:tentative="1">
+      <w:start w:val="1"/>
+      <w:numFmt w:val="lowerRoman"/>
+      <w:lvlText w:val="%9."/>
+      <w:lvlJc w:val="right"/>
+      <w:pPr>
+        <w:ind w:left="6480" w:hanging="180"/>
+      </w:pPr>
+    </w:lvl>
+  </w:abstractNum>
+  <w:abstractNum w:abstractNumId="9" w15:restartNumberingAfterBreak="0">
+    <w:nsid w:val="48535897"/>
+    <w:multiLevelType w:val="hybridMultilevel"/>
+    <w:tmpl w:val="5CC8EC7C"/>
+    <w:lvl w:ilvl="0" w:tplc="E7D42D26">
+      <w:start w:val="1"/>
+      <w:numFmt w:val="decimal"/>
+      <w:lvlText w:val="%1)"/>
+      <w:lvlJc w:val="left"/>
+      <w:pPr>
+        <w:ind w:left="1080" w:hanging="360"/>
+      </w:pPr>
+      <w:rPr>
+        <w:rFonts w:hint="default"/>
+        <w:b/>
+        <w:bCs/>
+      </w:rPr>
+    </w:lvl>
+    <w:lvl w:ilvl="1" w:tplc="04090019" w:tentative="1">
+      <w:start w:val="1"/>
+      <w:numFmt w:val="lowerLetter"/>
+      <w:lvlText w:val="%2."/>
+      <w:lvlJc w:val="left"/>
+      <w:pPr>
+        <w:ind w:left="1800" w:hanging="360"/>
+      </w:pPr>
+    </w:lvl>
+    <w:lvl w:ilvl="2" w:tplc="0409001B" w:tentative="1">
+      <w:start w:val="1"/>
+      <w:numFmt w:val="lowerRoman"/>
+      <w:lvlText w:val="%3."/>
+      <w:lvlJc w:val="right"/>
+      <w:pPr>
+        <w:ind w:left="2520" w:hanging="180"/>
+      </w:pPr>
+    </w:lvl>
+    <w:lvl w:ilvl="3" w:tplc="0409000F" w:tentative="1">
+      <w:start w:val="1"/>
+      <w:numFmt w:val="decimal"/>
+      <w:lvlText w:val="%4."/>
+      <w:lvlJc w:val="left"/>
+      <w:pPr>
+        <w:ind w:left="3240" w:hanging="360"/>
+      </w:pPr>
+    </w:lvl>
+    <w:lvl w:ilvl="4" w:tplc="04090019" w:tentative="1">
+      <w:start w:val="1"/>
+      <w:numFmt w:val="lowerLetter"/>
+      <w:lvlText w:val="%5."/>
+      <w:lvlJc w:val="left"/>
+      <w:pPr>
+        <w:ind w:left="3960" w:hanging="360"/>
+      </w:pPr>
+    </w:lvl>
+    <w:lvl w:ilvl="5" w:tplc="0409001B" w:tentative="1">
+      <w:start w:val="1"/>
+      <w:numFmt w:val="lowerRoman"/>
+      <w:lvlText w:val="%6."/>
+      <w:lvlJc w:val="right"/>
+      <w:pPr>
+        <w:ind w:left="4680" w:hanging="180"/>
+      </w:pPr>
+    </w:lvl>
+    <w:lvl w:ilvl="6" w:tplc="0409000F" w:tentative="1">
+      <w:start w:val="1"/>
+      <w:numFmt w:val="decimal"/>
+      <w:lvlText w:val="%7."/>
+      <w:lvlJc w:val="left"/>
+      <w:pPr>
+        <w:ind w:left="5400" w:hanging="360"/>
+      </w:pPr>
+    </w:lvl>
+    <w:lvl w:ilvl="7" w:tplc="04090019" w:tentative="1">
+      <w:start w:val="1"/>
+      <w:numFmt w:val="lowerLetter"/>
+      <w:lvlText w:val="%8."/>
+      <w:lvlJc w:val="left"/>
+      <w:pPr>
+        <w:ind w:left="6120" w:hanging="360"/>
+      </w:pPr>
+    </w:lvl>
+    <w:lvl w:ilvl="8" w:tplc="0409001B" w:tentative="1">
+      <w:start w:val="1"/>
+      <w:numFmt w:val="lowerRoman"/>
+      <w:lvlText w:val="%9."/>
+      <w:lvlJc w:val="right"/>
+      <w:pPr>
+        <w:ind w:left="6840" w:hanging="180"/>
+      </w:pPr>
+    </w:lvl>
+  </w:abstractNum>
+  <w:abstractNum w:abstractNumId="10" w15:restartNumberingAfterBreak="0">
     <w:nsid w:val="48C16804"/>
     <w:multiLevelType w:val="hybridMultilevel"/>
     <w:tmpl w:val="6EAE8890"/>
@@ -2355,7 +4430,7 @@
       <w:lvlJc w:val="left"/>
     </w:lvl>
   </w:abstractNum>
-  <w:abstractNum w:abstractNumId="7" w15:restartNumberingAfterBreak="0">
+  <w:abstractNum w:abstractNumId="11" w15:restartNumberingAfterBreak="0">
     <w:nsid w:val="5F440D4D"/>
     <w:multiLevelType w:val="multilevel"/>
     <w:tmpl w:val="9760AF42"/>
@@ -2473,6 +4548,118 @@
       </w:pPr>
       <w:rPr>
         <w:rFonts w:hint="default"/>
+      </w:rPr>
+    </w:lvl>
+  </w:abstractNum>
+  <w:abstractNum w:abstractNumId="12" w15:restartNumberingAfterBreak="0">
+    <w:nsid w:val="775973CC"/>
+    <w:multiLevelType w:val="hybridMultilevel"/>
+    <w:tmpl w:val="04B00FB4"/>
+    <w:lvl w:ilvl="0" w:tplc="2B0CB4AE">
+      <w:numFmt w:val="bullet"/>
+      <w:lvlText w:val="-"/>
+      <w:lvlJc w:val="left"/>
+      <w:pPr>
+        <w:ind w:left="720" w:hanging="360"/>
+      </w:pPr>
+      <w:rPr>
+        <w:rFonts w:ascii="Arial" w:eastAsia="Arial" w:hAnsi="Arial" w:cs="Arial" w:hint="default"/>
+      </w:rPr>
+    </w:lvl>
+    <w:lvl w:ilvl="1" w:tplc="04090003" w:tentative="1">
+      <w:start w:val="1"/>
+      <w:numFmt w:val="bullet"/>
+      <w:lvlText w:val="o"/>
+      <w:lvlJc w:val="left"/>
+      <w:pPr>
+        <w:ind w:left="1440" w:hanging="360"/>
+      </w:pPr>
+      <w:rPr>
+        <w:rFonts w:ascii="Courier New" w:hAnsi="Courier New" w:cs="Courier New" w:hint="default"/>
+      </w:rPr>
+    </w:lvl>
+    <w:lvl w:ilvl="2" w:tplc="04090005" w:tentative="1">
+      <w:start w:val="1"/>
+      <w:numFmt w:val="bullet"/>
+      <w:lvlText w:val=""/>
+      <w:lvlJc w:val="left"/>
+      <w:pPr>
+        <w:ind w:left="2160" w:hanging="360"/>
+      </w:pPr>
+      <w:rPr>
+        <w:rFonts w:ascii="Wingdings" w:hAnsi="Wingdings" w:hint="default"/>
+      </w:rPr>
+    </w:lvl>
+    <w:lvl w:ilvl="3" w:tplc="04090001" w:tentative="1">
+      <w:start w:val="1"/>
+      <w:numFmt w:val="bullet"/>
+      <w:lvlText w:val=""/>
+      <w:lvlJc w:val="left"/>
+      <w:pPr>
+        <w:ind w:left="2880" w:hanging="360"/>
+      </w:pPr>
+      <w:rPr>
+        <w:rFonts w:ascii="Symbol" w:hAnsi="Symbol" w:hint="default"/>
+      </w:rPr>
+    </w:lvl>
+    <w:lvl w:ilvl="4" w:tplc="04090003" w:tentative="1">
+      <w:start w:val="1"/>
+      <w:numFmt w:val="bullet"/>
+      <w:lvlText w:val="o"/>
+      <w:lvlJc w:val="left"/>
+      <w:pPr>
+        <w:ind w:left="3600" w:hanging="360"/>
+      </w:pPr>
+      <w:rPr>
+        <w:rFonts w:ascii="Courier New" w:hAnsi="Courier New" w:cs="Courier New" w:hint="default"/>
+      </w:rPr>
+    </w:lvl>
+    <w:lvl w:ilvl="5" w:tplc="04090005" w:tentative="1">
+      <w:start w:val="1"/>
+      <w:numFmt w:val="bullet"/>
+      <w:lvlText w:val=""/>
+      <w:lvlJc w:val="left"/>
+      <w:pPr>
+        <w:ind w:left="4320" w:hanging="360"/>
+      </w:pPr>
+      <w:rPr>
+        <w:rFonts w:ascii="Wingdings" w:hAnsi="Wingdings" w:hint="default"/>
+      </w:rPr>
+    </w:lvl>
+    <w:lvl w:ilvl="6" w:tplc="04090001" w:tentative="1">
+      <w:start w:val="1"/>
+      <w:numFmt w:val="bullet"/>
+      <w:lvlText w:val=""/>
+      <w:lvlJc w:val="left"/>
+      <w:pPr>
+        <w:ind w:left="5040" w:hanging="360"/>
+      </w:pPr>
+      <w:rPr>
+        <w:rFonts w:ascii="Symbol" w:hAnsi="Symbol" w:hint="default"/>
+      </w:rPr>
+    </w:lvl>
+    <w:lvl w:ilvl="7" w:tplc="04090003" w:tentative="1">
+      <w:start w:val="1"/>
+      <w:numFmt w:val="bullet"/>
+      <w:lvlText w:val="o"/>
+      <w:lvlJc w:val="left"/>
+      <w:pPr>
+        <w:ind w:left="5760" w:hanging="360"/>
+      </w:pPr>
+      <w:rPr>
+        <w:rFonts w:ascii="Courier New" w:hAnsi="Courier New" w:cs="Courier New" w:hint="default"/>
+      </w:rPr>
+    </w:lvl>
+    <w:lvl w:ilvl="8" w:tplc="04090005" w:tentative="1">
+      <w:start w:val="1"/>
+      <w:numFmt w:val="bullet"/>
+      <w:lvlText w:val=""/>
+      <w:lvlJc w:val="left"/>
+      <w:pPr>
+        <w:ind w:left="6480" w:hanging="360"/>
+      </w:pPr>
+      <w:rPr>
+        <w:rFonts w:ascii="Wingdings" w:hAnsi="Wingdings" w:hint="default"/>
       </w:rPr>
     </w:lvl>
   </w:abstractNum>
@@ -2480,10 +4667,10 @@
     <w:abstractNumId w:val="2"/>
   </w:num>
   <w:num w:numId="2" w16cid:durableId="982588660">
-    <w:abstractNumId w:val="3"/>
+    <w:abstractNumId w:val="5"/>
   </w:num>
   <w:num w:numId="3" w16cid:durableId="216016821">
-    <w:abstractNumId w:val="7"/>
+    <w:abstractNumId w:val="11"/>
   </w:num>
   <w:num w:numId="4" w16cid:durableId="87311749">
     <w:abstractNumId w:val="0"/>
@@ -2492,15 +4679,30 @@
     <w:abstractNumId w:val="1"/>
   </w:num>
   <w:num w:numId="6" w16cid:durableId="589046622">
-    <w:abstractNumId w:val="6"/>
+    <w:abstractNumId w:val="10"/>
     <w:lvlOverride w:ilvl="0">
       <w:startOverride w:val="1"/>
     </w:lvlOverride>
   </w:num>
   <w:num w:numId="7" w16cid:durableId="812521704">
-    <w:abstractNumId w:val="5"/>
+    <w:abstractNumId w:val="7"/>
   </w:num>
   <w:num w:numId="8" w16cid:durableId="1193617459">
+    <w:abstractNumId w:val="6"/>
+  </w:num>
+  <w:num w:numId="9" w16cid:durableId="1822499832">
+    <w:abstractNumId w:val="12"/>
+  </w:num>
+  <w:num w:numId="10" w16cid:durableId="162938754">
+    <w:abstractNumId w:val="3"/>
+  </w:num>
+  <w:num w:numId="11" w16cid:durableId="1694530102">
+    <w:abstractNumId w:val="9"/>
+  </w:num>
+  <w:num w:numId="12" w16cid:durableId="1214543265">
+    <w:abstractNumId w:val="8"/>
+  </w:num>
+  <w:num w:numId="13" w16cid:durableId="1561987833">
     <w:abstractNumId w:val="4"/>
   </w:num>
 </w:numbering>
@@ -3429,6 +5631,55 @@
       <w:spacing w:val="5"/>
     </w:rPr>
   </w:style>
+  <w:style w:type="table" w:styleId="TableGrid">
+    <w:name w:val="Table Grid"/>
+    <w:basedOn w:val="TableNormal"/>
+    <w:uiPriority w:val="39"/>
+    <w:rsid w:val="00E11605"/>
+    <w:pPr>
+      <w:spacing w:after="0" w:line="240" w:lineRule="auto"/>
+    </w:pPr>
+    <w:tblPr>
+      <w:tblBorders>
+        <w:top w:val="single" w:sz="4" w:space="0" w:color="auto"/>
+        <w:left w:val="single" w:sz="4" w:space="0" w:color="auto"/>
+        <w:bottom w:val="single" w:sz="4" w:space="0" w:color="auto"/>
+        <w:right w:val="single" w:sz="4" w:space="0" w:color="auto"/>
+        <w:insideH w:val="single" w:sz="4" w:space="0" w:color="auto"/>
+        <w:insideV w:val="single" w:sz="4" w:space="0" w:color="auto"/>
+      </w:tblBorders>
+    </w:tblPr>
+  </w:style>
+  <w:style w:type="character" w:customStyle="1" w:styleId="citation-181">
+    <w:name w:val="citation-181"/>
+    <w:basedOn w:val="DefaultParagraphFont"/>
+    <w:rsid w:val="001D2261"/>
+  </w:style>
+  <w:style w:type="character" w:customStyle="1" w:styleId="apple-converted-space">
+    <w:name w:val="apple-converted-space"/>
+    <w:basedOn w:val="DefaultParagraphFont"/>
+    <w:rsid w:val="001D2261"/>
+  </w:style>
+  <w:style w:type="character" w:customStyle="1" w:styleId="citation-180">
+    <w:name w:val="citation-180"/>
+    <w:basedOn w:val="DefaultParagraphFont"/>
+    <w:rsid w:val="001D2261"/>
+  </w:style>
+  <w:style w:type="character" w:customStyle="1" w:styleId="citation-179">
+    <w:name w:val="citation-179"/>
+    <w:basedOn w:val="DefaultParagraphFont"/>
+    <w:rsid w:val="001D2261"/>
+  </w:style>
+  <w:style w:type="character" w:customStyle="1" w:styleId="citation-178">
+    <w:name w:val="citation-178"/>
+    <w:basedOn w:val="DefaultParagraphFont"/>
+    <w:rsid w:val="001D2261"/>
+  </w:style>
+  <w:style w:type="character" w:customStyle="1" w:styleId="citation-177">
+    <w:name w:val="citation-177"/>
+    <w:basedOn w:val="DefaultParagraphFont"/>
+    <w:rsid w:val="001D2261"/>
+  </w:style>
 </w:styles>
 </file>
 

</xml_diff>